<commit_message>
Completed wrapping main functions for error handling.
</commit_message>
<xml_diff>
--- a/docs/SeagrassRestorationTools_UserManual.docx
+++ b/docs/SeagrassRestorationTools_UserManual.docx
@@ -1,6 +1,6 @@
 
 <file path=word/document.xml><?xml version="1.0" encoding="utf-8"?>
-<w:document xmlns:wpc="http://schemas.microsoft.com/office/word/2010/wordprocessingCanvas" xmlns:cx="http://schemas.microsoft.com/office/drawing/2014/chartex" xmlns:cx1="http://schemas.microsoft.com/office/drawing/2015/9/8/chartex" xmlns:cx2="http://schemas.microsoft.com/office/drawing/2015/10/21/chartex" xmlns:cx3="http://schemas.microsoft.com/office/drawing/2016/5/9/chartex" xmlns:cx4="http://schemas.microsoft.com/office/drawing/2016/5/10/chartex" xmlns:cx5="http://schemas.microsoft.com/office/drawing/2016/5/11/chartex" xmlns:cx6="http://schemas.microsoft.com/office/drawing/2016/5/12/chartex" xmlns:cx7="http://schemas.microsoft.com/office/drawing/2016/5/13/chartex" xmlns:cx8="http://schemas.microsoft.com/office/drawing/2016/5/14/chartex" xmlns:mc="http://schemas.openxmlformats.org/markup-compatibility/2006" xmlns:aink="http://schemas.microsoft.com/office/drawing/2016/ink" xmlns:am3d="http://schemas.microsoft.com/office/drawing/2017/model3d" xmlns:o="urn:schemas-microsoft-com:office:office" xmlns:oel="http://schemas.microsoft.com/office/2019/extlst" xmlns:r="http://schemas.openxmlformats.org/officeDocument/2006/relationships" xmlns:m="http://schemas.openxmlformats.org/officeDocument/2006/math" xmlns:v="urn:schemas-microsoft-com:vml" xmlns:wp14="http://schemas.microsoft.com/office/word/2010/wordprocessingDrawing" xmlns:wp="http://schemas.openxmlformats.org/drawingml/2006/wordprocessingDrawing" xmlns:w10="urn:schemas-microsoft-com:office:word" xmlns:w="http://schemas.openxmlformats.org/wordprocessingml/2006/main" xmlns:w14="http://schemas.microsoft.com/office/word/2010/wordml" xmlns:w15="http://schemas.microsoft.com/office/word/2012/wordml" xmlns:w16cex="http://schemas.microsoft.com/office/word/2018/wordml/cex" xmlns:w16cid="http://schemas.microsoft.com/office/word/2016/wordml/cid" xmlns:w16="http://schemas.microsoft.com/office/word/2018/wordml" xmlns:w16du="http://schemas.microsoft.com/office/word/2023/wordml/word16du" xmlns:w16sdtdh="http://schemas.microsoft.com/office/word/2020/wordml/sdtdatahash" xmlns:w16sdtfl="http://schemas.microsoft.com/office/word/2024/wordml/sdtformatlock" xmlns:w16se="http://schemas.microsoft.com/office/word/2015/wordml/symex" xmlns:wpg="http://schemas.microsoft.com/office/word/2010/wordprocessingGroup" xmlns:wpi="http://schemas.microsoft.com/office/word/2010/wordprocessingInk" xmlns:wne="http://schemas.microsoft.com/office/word/2006/wordml" xmlns:wps="http://schemas.microsoft.com/office/word/2010/wordprocessingShape" mc:Ignorable="w14 w15 w16se w16cid w16 w16cex w16sdtdh w16sdtfl w16du wp14">
+<w:document xmlns:wpc="http://schemas.microsoft.com/office/word/2010/wordprocessingCanvas" xmlns:cx="http://schemas.microsoft.com/office/drawing/2014/chartex" xmlns:cx1="http://schemas.microsoft.com/office/drawing/2015/9/8/chartex" xmlns:cx2="http://schemas.microsoft.com/office/drawing/2015/10/21/chartex" xmlns:cx3="http://schemas.microsoft.com/office/drawing/2016/5/9/chartex" xmlns:cx4="http://schemas.microsoft.com/office/drawing/2016/5/10/chartex" xmlns:cx5="http://schemas.microsoft.com/office/drawing/2016/5/11/chartex" xmlns:cx6="http://schemas.microsoft.com/office/drawing/2016/5/12/chartex" xmlns:cx7="http://schemas.microsoft.com/office/drawing/2016/5/13/chartex" xmlns:cx8="http://schemas.microsoft.com/office/drawing/2016/5/14/chartex" xmlns:mc="http://schemas.openxmlformats.org/markup-compatibility/2006" xmlns:m="http://schemas.openxmlformats.org/officeDocument/2006/math" xmlns:aink="http://schemas.microsoft.com/office/drawing/2016/ink" xmlns:am3d="http://schemas.microsoft.com/office/drawing/2017/model3d" xmlns:oel="http://schemas.microsoft.com/office/2019/extlst" xmlns:r="http://schemas.openxmlformats.org/officeDocument/2006/relationships" xmlns:wp14="http://schemas.microsoft.com/office/word/2010/wordprocessingDrawing" xmlns:wp="http://schemas.openxmlformats.org/drawingml/2006/wordprocessingDrawing" xmlns:wpg="http://schemas.microsoft.com/office/word/2010/wordprocessingGroup" xmlns:wpi="http://schemas.microsoft.com/office/word/2010/wordprocessingInk" xmlns:wps="http://schemas.microsoft.com/office/word/2010/wordprocessingShape" xmlns:o="urn:schemas-microsoft-com:office:office" xmlns:v="urn:schemas-microsoft-com:vml" xmlns:w10="urn:schemas-microsoft-com:office:word" xmlns:w="http://schemas.openxmlformats.org/wordprocessingml/2006/main" xmlns:w14="http://schemas.microsoft.com/office/word/2010/wordml" xmlns:w15="http://schemas.microsoft.com/office/word/2012/wordml" xmlns:w16cei="http://schemas.microsoft.com/office/word/2026/wordml/cei" xmlns:w16cex="http://schemas.microsoft.com/office/word/2018/wordml/cex" xmlns:w16cid="http://schemas.microsoft.com/office/word/2016/wordml/cid" xmlns:w16="http://schemas.microsoft.com/office/word/2018/wordml" xmlns:w16sdtdh="http://schemas.microsoft.com/office/word/2020/wordml/sdtdatahash" xmlns:w16sdtfl="http://schemas.microsoft.com/office/word/2024/wordml/sdtformatlock" xmlns:w16se="http://schemas.microsoft.com/office/word/2015/wordml/symex" xmlns:w16du="http://schemas.microsoft.com/office/word/2023/wordml/word16du" xmlns:wne="http://schemas.microsoft.com/office/word/2006/wordml" mc:Ignorable="w14 w15 w16se w16cid w16 w16cex w16sdtdh w16sdtfl w16du wp14">
   <w:body>
     <w:p>
       <w:r>
@@ -39,7 +39,15 @@
     </w:p>
     <w:p>
       <w:r>
-        <w:t>the Seagrass Restoration Database Design</w:t>
+        <w:t>T</w:t>
+      </w:r>
+      <w:r>
+        <w:t>he Seagrass Restoration Database Design</w:t>
+      </w:r>
+    </w:p>
+    <w:p>
+      <w:r>
+        <w:t>The database view</w:t>
       </w:r>
     </w:p>
     <w:p/>
@@ -54,7 +62,7 @@
 </file>
 
 <file path=word/styles.xml><?xml version="1.0" encoding="utf-8"?>
-<w:styles xmlns:mc="http://schemas.openxmlformats.org/markup-compatibility/2006" xmlns:r="http://schemas.openxmlformats.org/officeDocument/2006/relationships" xmlns:w="http://schemas.openxmlformats.org/wordprocessingml/2006/main" xmlns:w14="http://schemas.microsoft.com/office/word/2010/wordml" xmlns:w15="http://schemas.microsoft.com/office/word/2012/wordml" xmlns:w16cex="http://schemas.microsoft.com/office/word/2018/wordml/cex" xmlns:w16cid="http://schemas.microsoft.com/office/word/2016/wordml/cid" xmlns:w16="http://schemas.microsoft.com/office/word/2018/wordml" xmlns:w16du="http://schemas.microsoft.com/office/word/2023/wordml/word16du" xmlns:w16sdtdh="http://schemas.microsoft.com/office/word/2020/wordml/sdtdatahash" xmlns:w16sdtfl="http://schemas.microsoft.com/office/word/2024/wordml/sdtformatlock" xmlns:w16se="http://schemas.microsoft.com/office/word/2015/wordml/symex" mc:Ignorable="w14 w15 w16se w16cid w16 w16cex w16sdtdh w16sdtfl w16du">
+<w:styles xmlns:mc="http://schemas.openxmlformats.org/markup-compatibility/2006" xmlns:r="http://schemas.openxmlformats.org/officeDocument/2006/relationships" xmlns:w="http://schemas.openxmlformats.org/wordprocessingml/2006/main" xmlns:w14="http://schemas.microsoft.com/office/word/2010/wordml" xmlns:w15="http://schemas.microsoft.com/office/word/2012/wordml" xmlns:w16cex="http://schemas.microsoft.com/office/word/2018/wordml/cex" xmlns:w16cid="http://schemas.microsoft.com/office/word/2016/wordml/cid" xmlns:w16="http://schemas.microsoft.com/office/word/2018/wordml" xmlns:w16sdtdh="http://schemas.microsoft.com/office/word/2020/wordml/sdtdatahash" xmlns:w16sdtfl="http://schemas.microsoft.com/office/word/2024/wordml/sdtformatlock" xmlns:w16se="http://schemas.microsoft.com/office/word/2015/wordml/symex" xmlns:w16du="http://schemas.microsoft.com/office/word/2023/wordml/word16du" mc:Ignorable="w14 w15 w16se w16cid w16 w16cex w16sdtdh w16sdtfl w16du">
   <w:docDefaults>
     <w:rPrDefault>
       <w:rPr>

</xml_diff>

<commit_message>
Edits to user manual.
</commit_message>
<xml_diff>
--- a/docs/SeagrassRestorationTools_UserManual.docx
+++ b/docs/SeagrassRestorationTools_UserManual.docx
@@ -1,38 +1,220 @@
 
 <file path=word/document.xml><?xml version="1.0" encoding="utf-8"?>
-<w:document xmlns:wpc="http://schemas.microsoft.com/office/word/2010/wordprocessingCanvas" xmlns:cx="http://schemas.microsoft.com/office/drawing/2014/chartex" xmlns:cx1="http://schemas.microsoft.com/office/drawing/2015/9/8/chartex" xmlns:cx2="http://schemas.microsoft.com/office/drawing/2015/10/21/chartex" xmlns:cx3="http://schemas.microsoft.com/office/drawing/2016/5/9/chartex" xmlns:cx4="http://schemas.microsoft.com/office/drawing/2016/5/10/chartex" xmlns:cx5="http://schemas.microsoft.com/office/drawing/2016/5/11/chartex" xmlns:cx6="http://schemas.microsoft.com/office/drawing/2016/5/12/chartex" xmlns:cx7="http://schemas.microsoft.com/office/drawing/2016/5/13/chartex" xmlns:cx8="http://schemas.microsoft.com/office/drawing/2016/5/14/chartex" xmlns:mc="http://schemas.openxmlformats.org/markup-compatibility/2006" xmlns:m="http://schemas.openxmlformats.org/officeDocument/2006/math" xmlns:aink="http://schemas.microsoft.com/office/drawing/2016/ink" xmlns:am3d="http://schemas.microsoft.com/office/drawing/2017/model3d" xmlns:oel="http://schemas.microsoft.com/office/2019/extlst" xmlns:r="http://schemas.openxmlformats.org/officeDocument/2006/relationships" xmlns:wp14="http://schemas.microsoft.com/office/word/2010/wordprocessingDrawing" xmlns:wp="http://schemas.openxmlformats.org/drawingml/2006/wordprocessingDrawing" xmlns:wpg="http://schemas.microsoft.com/office/word/2010/wordprocessingGroup" xmlns:wpi="http://schemas.microsoft.com/office/word/2010/wordprocessingInk" xmlns:wps="http://schemas.microsoft.com/office/word/2010/wordprocessingShape" xmlns:o="urn:schemas-microsoft-com:office:office" xmlns:v="urn:schemas-microsoft-com:vml" xmlns:w10="urn:schemas-microsoft-com:office:word" xmlns:w="http://schemas.openxmlformats.org/wordprocessingml/2006/main" xmlns:w14="http://schemas.microsoft.com/office/word/2010/wordml" xmlns:w15="http://schemas.microsoft.com/office/word/2012/wordml" xmlns:w16cei="http://schemas.microsoft.com/office/word/2026/wordml/cei" xmlns:w16cex="http://schemas.microsoft.com/office/word/2018/wordml/cex" xmlns:w16cid="http://schemas.microsoft.com/office/word/2016/wordml/cid" xmlns:w16="http://schemas.microsoft.com/office/word/2018/wordml" xmlns:w16sdtdh="http://schemas.microsoft.com/office/word/2020/wordml/sdtdatahash" xmlns:w16sdtfl="http://schemas.microsoft.com/office/word/2024/wordml/sdtformatlock" xmlns:w16se="http://schemas.microsoft.com/office/word/2015/wordml/symex" xmlns:w16du="http://schemas.microsoft.com/office/word/2023/wordml/word16du" xmlns:wne="http://schemas.microsoft.com/office/word/2006/wordml" mc:Ignorable="w14 w15 w16se w16cid w16 w16cex w16sdtdh w16sdtfl w16du wp14">
+<w:document xmlns:wpc="http://schemas.microsoft.com/office/word/2010/wordprocessingCanvas" xmlns:cx="http://schemas.microsoft.com/office/drawing/2014/chartex" xmlns:cx1="http://schemas.microsoft.com/office/drawing/2015/9/8/chartex" xmlns:cx2="http://schemas.microsoft.com/office/drawing/2015/10/21/chartex" xmlns:cx3="http://schemas.microsoft.com/office/drawing/2016/5/9/chartex" xmlns:cx4="http://schemas.microsoft.com/office/drawing/2016/5/10/chartex" xmlns:cx5="http://schemas.microsoft.com/office/drawing/2016/5/11/chartex" xmlns:cx6="http://schemas.microsoft.com/office/drawing/2016/5/12/chartex" xmlns:cx7="http://schemas.microsoft.com/office/drawing/2016/5/13/chartex" xmlns:cx8="http://schemas.microsoft.com/office/drawing/2016/5/14/chartex" xmlns:mc="http://schemas.openxmlformats.org/markup-compatibility/2006" xmlns:aink="http://schemas.microsoft.com/office/drawing/2016/ink" xmlns:am3d="http://schemas.microsoft.com/office/drawing/2017/model3d" xmlns:o="urn:schemas-microsoft-com:office:office" xmlns:oel="http://schemas.microsoft.com/office/2019/extlst" xmlns:r="http://schemas.openxmlformats.org/officeDocument/2006/relationships" xmlns:m="http://schemas.openxmlformats.org/officeDocument/2006/math" xmlns:v="urn:schemas-microsoft-com:vml" xmlns:wp14="http://schemas.microsoft.com/office/word/2010/wordprocessingDrawing" xmlns:wp="http://schemas.openxmlformats.org/drawingml/2006/wordprocessingDrawing" xmlns:w10="urn:schemas-microsoft-com:office:word" xmlns:w="http://schemas.openxmlformats.org/wordprocessingml/2006/main" xmlns:w14="http://schemas.microsoft.com/office/word/2010/wordml" xmlns:w15="http://schemas.microsoft.com/office/word/2012/wordml" xmlns:w16cex="http://schemas.microsoft.com/office/word/2018/wordml/cex" xmlns:w16cid="http://schemas.microsoft.com/office/word/2016/wordml/cid" xmlns:w16="http://schemas.microsoft.com/office/word/2018/wordml" xmlns:w16du="http://schemas.microsoft.com/office/word/2023/wordml/word16du" xmlns:w16sdtdh="http://schemas.microsoft.com/office/word/2020/wordml/sdtdatahash" xmlns:w16sdtfl="http://schemas.microsoft.com/office/word/2024/wordml/sdtformatlock" xmlns:w16se="http://schemas.microsoft.com/office/word/2015/wordml/symex" xmlns:wpg="http://schemas.microsoft.com/office/word/2010/wordprocessingGroup" xmlns:wpi="http://schemas.microsoft.com/office/word/2010/wordprocessingInk" xmlns:wne="http://schemas.microsoft.com/office/word/2006/wordml" xmlns:wps="http://schemas.microsoft.com/office/word/2010/wordprocessingShape" mc:Ignorable="w14 w15 w16se w16cid w16 w16cex w16sdtdh w16sdtfl w16du wp14">
   <w:body>
     <w:p>
+      <w:pPr>
+        <w:pStyle w:val="Title"/>
+      </w:pPr>
       <w:r>
         <w:t>Seagrass Restoration Tools – User Manual</w:t>
       </w:r>
     </w:p>
     <w:p/>
     <w:p>
+      <w:pPr>
+        <w:pStyle w:val="Heading5"/>
+      </w:pPr>
       <w:r>
         <w:t>version notes</w:t>
       </w:r>
     </w:p>
+    <w:p>
+      <w:pPr>
+        <w:rPr>
+          <w:sz w:val="22"/>
+          <w:szCs w:val="22"/>
+        </w:rPr>
+      </w:pPr>
+      <w:r>
+        <w:rPr>
+          <w:sz w:val="22"/>
+          <w:szCs w:val="22"/>
+        </w:rPr>
+        <w:t>R version</w:t>
+      </w:r>
+    </w:p>
+    <w:p>
+      <w:pPr>
+        <w:rPr>
+          <w:sz w:val="22"/>
+          <w:szCs w:val="22"/>
+        </w:rPr>
+      </w:pPr>
+      <w:proofErr w:type="spellStart"/>
+      <w:r>
+        <w:rPr>
+          <w:sz w:val="22"/>
+          <w:szCs w:val="22"/>
+        </w:rPr>
+        <w:t>Tidyverse</w:t>
+      </w:r>
+      <w:proofErr w:type="spellEnd"/>
+      <w:r>
+        <w:rPr>
+          <w:sz w:val="22"/>
+          <w:szCs w:val="22"/>
+        </w:rPr>
+        <w:t>, sf, ?</w:t>
+      </w:r>
+    </w:p>
+    <w:p>
+      <w:pPr>
+        <w:rPr>
+          <w:sz w:val="22"/>
+          <w:szCs w:val="22"/>
+        </w:rPr>
+      </w:pPr>
+    </w:p>
+    <w:p>
+      <w:pPr>
+        <w:pStyle w:val="Heading5"/>
+      </w:pPr>
+      <w:r>
+        <w:t>purpose of tools / purpose of manual</w:t>
+      </w:r>
+    </w:p>
     <w:p/>
     <w:p>
-      <w:r>
-        <w:t>purpose of tools / purpose of manual</w:t>
+      <w:pPr>
+        <w:pStyle w:val="Heading1"/>
+      </w:pPr>
+      <w:r>
+        <w:t>S</w:t>
+      </w:r>
+      <w:r>
+        <w:t>etup –how to prepare to use</w:t>
+      </w:r>
+    </w:p>
+    <w:p>
+      <w:pPr>
+        <w:pStyle w:val="Heading2"/>
+      </w:pPr>
+      <w:r>
+        <w:t>Get the code</w:t>
+      </w:r>
+    </w:p>
+    <w:p>
+      <w:r>
+        <w:t xml:space="preserve">URL to </w:t>
+      </w:r>
+      <w:proofErr w:type="spellStart"/>
+      <w:r>
+        <w:t>Github</w:t>
+      </w:r>
+      <w:proofErr w:type="spellEnd"/>
+      <w:r>
+        <w:t xml:space="preserve"> repo.  Cloning from command line.</w:t>
+      </w:r>
+    </w:p>
+    <w:p>
+      <w:pPr>
+        <w:pStyle w:val="Heading2"/>
+      </w:pPr>
+      <w:r>
+        <w:t>Install required packages</w:t>
+      </w:r>
+    </w:p>
+    <w:p>
+      <w:r>
+        <w:t>Checking from R console</w:t>
+      </w:r>
+    </w:p>
+    <w:p>
+      <w:r>
+        <w:t>Installing from R console</w:t>
       </w:r>
     </w:p>
     <w:p/>
     <w:p>
-      <w:r>
-        <w:t>setup – code and how to prepare to use</w:t>
+      <w:pPr>
+        <w:pStyle w:val="Heading2"/>
+      </w:pPr>
+      <w:r>
+        <w:t>Adding R executable to the path</w:t>
+      </w:r>
+    </w:p>
+    <w:p>
+      <w:r>
+        <w:t>Tools can be used within RStudio without any preparation if the R code for the tools is within your current project folder and the required packages are installed.  This approach does require opening the RStudio application.</w:t>
+      </w:r>
+    </w:p>
+    <w:p>
+      <w:r>
+        <w:t xml:space="preserve">The more lightweight alternative is to run the tools from a terminal which could be </w:t>
+      </w:r>
+      <w:proofErr w:type="spellStart"/>
+      <w:r>
+        <w:t>Powershell</w:t>
+      </w:r>
+      <w:proofErr w:type="spellEnd"/>
+      <w:r>
+        <w:t xml:space="preserve"> or </w:t>
+      </w:r>
+      <w:proofErr w:type="spellStart"/>
+      <w:r>
+        <w:t>commant</w:t>
+      </w:r>
+      <w:proofErr w:type="spellEnd"/>
+      <w:r>
+        <w:t xml:space="preserve"> prompt.</w:t>
+      </w:r>
+    </w:p>
+    <w:p>
+      <w:r>
+        <w:t xml:space="preserve">Discussion of </w:t>
+      </w:r>
+      <w:proofErr w:type="spellStart"/>
+      <w:r>
+        <w:t>Rscript</w:t>
+      </w:r>
+      <w:proofErr w:type="spellEnd"/>
+      <w:r>
+        <w:t xml:space="preserve">, Rterm and </w:t>
+      </w:r>
+      <w:proofErr w:type="spellStart"/>
+      <w:r>
+        <w:t>Rcmd</w:t>
+      </w:r>
+      <w:proofErr w:type="spellEnd"/>
+      <w:r>
+        <w:t xml:space="preserve">:  </w:t>
+      </w:r>
+      <w:r>
+        <w:t>https://www.rdocumentation.org/packages/this.path/versions/0.4.4/topics/Running.R.from.the.command-line</w:t>
       </w:r>
     </w:p>
     <w:p/>
     <w:p>
       <w:r>
+        <w:t>Test if Rterm is on the path of your system.</w:t>
+      </w:r>
+    </w:p>
+    <w:p>
+      <w:r>
+        <w:t>Find where the Rterm command resides on your system.</w:t>
+      </w:r>
+    </w:p>
+    <w:p>
+      <w:r>
+        <w:t>Add this location to your path</w:t>
+      </w:r>
+    </w:p>
+    <w:p>
+      <w:pPr>
+        <w:pStyle w:val="Heading1"/>
+      </w:pPr>
+      <w:r>
+        <w:lastRenderedPageBreak/>
         <w:t>Use of tools</w:t>
       </w:r>
     </w:p>
     <w:p/>
-    <w:p>
+    <w:p/>
+    <w:p>
+      <w:pPr>
+        <w:pStyle w:val="Heading1"/>
+      </w:pPr>
       <w:r>
         <w:t>Appendices</w:t>
       </w:r>
@@ -50,7 +232,11 @@
         <w:t>The database view</w:t>
       </w:r>
     </w:p>
-    <w:p/>
+    <w:p>
+      <w:r>
+        <w:t>Code Structure</w:t>
+      </w:r>
+    </w:p>
     <w:sectPr>
       <w:pgSz w:w="12240" w:h="15840"/>
       <w:pgMar w:top="1440" w:right="1440" w:bottom="1440" w:left="1440" w:header="720" w:footer="720" w:gutter="0"/>
@@ -61,8 +247,138 @@
 </w:document>
 </file>
 
+<file path=word/numbering.xml><?xml version="1.0" encoding="utf-8"?>
+<w:numbering xmlns:wpc="http://schemas.microsoft.com/office/word/2010/wordprocessingCanvas" xmlns:cx="http://schemas.microsoft.com/office/drawing/2014/chartex" xmlns:cx1="http://schemas.microsoft.com/office/drawing/2015/9/8/chartex" xmlns:cx2="http://schemas.microsoft.com/office/drawing/2015/10/21/chartex" xmlns:cx3="http://schemas.microsoft.com/office/drawing/2016/5/9/chartex" xmlns:cx4="http://schemas.microsoft.com/office/drawing/2016/5/10/chartex" xmlns:cx5="http://schemas.microsoft.com/office/drawing/2016/5/11/chartex" xmlns:cx6="http://schemas.microsoft.com/office/drawing/2016/5/12/chartex" xmlns:cx7="http://schemas.microsoft.com/office/drawing/2016/5/13/chartex" xmlns:cx8="http://schemas.microsoft.com/office/drawing/2016/5/14/chartex" xmlns:mc="http://schemas.openxmlformats.org/markup-compatibility/2006" xmlns:aink="http://schemas.microsoft.com/office/drawing/2016/ink" xmlns:am3d="http://schemas.microsoft.com/office/drawing/2017/model3d" xmlns:o="urn:schemas-microsoft-com:office:office" xmlns:oel="http://schemas.microsoft.com/office/2019/extlst" xmlns:r="http://schemas.openxmlformats.org/officeDocument/2006/relationships" xmlns:m="http://schemas.openxmlformats.org/officeDocument/2006/math" xmlns:v="urn:schemas-microsoft-com:vml" xmlns:wp14="http://schemas.microsoft.com/office/word/2010/wordprocessingDrawing" xmlns:wp="http://schemas.openxmlformats.org/drawingml/2006/wordprocessingDrawing" xmlns:w10="urn:schemas-microsoft-com:office:word" xmlns:w="http://schemas.openxmlformats.org/wordprocessingml/2006/main" xmlns:w14="http://schemas.microsoft.com/office/word/2010/wordml" xmlns:w15="http://schemas.microsoft.com/office/word/2012/wordml" xmlns:w16cex="http://schemas.microsoft.com/office/word/2018/wordml/cex" xmlns:w16cid="http://schemas.microsoft.com/office/word/2016/wordml/cid" xmlns:w16="http://schemas.microsoft.com/office/word/2018/wordml" xmlns:w16du="http://schemas.microsoft.com/office/word/2023/wordml/word16du" xmlns:w16sdtdh="http://schemas.microsoft.com/office/word/2020/wordml/sdtdatahash" xmlns:w16sdtfl="http://schemas.microsoft.com/office/word/2024/wordml/sdtformatlock" xmlns:w16se="http://schemas.microsoft.com/office/word/2015/wordml/symex" xmlns:wpg="http://schemas.microsoft.com/office/word/2010/wordprocessingGroup" xmlns:wpi="http://schemas.microsoft.com/office/word/2010/wordprocessingInk" xmlns:wne="http://schemas.microsoft.com/office/word/2006/wordml" xmlns:wps="http://schemas.microsoft.com/office/word/2010/wordprocessingShape" mc:Ignorable="w14 w15 w16se w16cid w16 w16cex w16sdtdh w16sdtfl w16du wp14">
+  <w:abstractNum w:abstractNumId="0" w15:restartNumberingAfterBreak="0">
+    <w:nsid w:val="4AC10A2B"/>
+    <w:multiLevelType w:val="multilevel"/>
+    <w:tmpl w:val="1206D3CE"/>
+    <w:lvl w:ilvl="0">
+      <w:start w:val="1"/>
+      <w:numFmt w:val="decimal"/>
+      <w:pStyle w:val="Heading1"/>
+      <w:lvlText w:val="%1"/>
+      <w:lvlJc w:val="left"/>
+      <w:pPr>
+        <w:ind w:left="432" w:hanging="432"/>
+      </w:pPr>
+      <w:rPr>
+        <w:rFonts w:hint="default"/>
+      </w:rPr>
+    </w:lvl>
+    <w:lvl w:ilvl="1">
+      <w:start w:val="1"/>
+      <w:numFmt w:val="decimal"/>
+      <w:pStyle w:val="Heading2"/>
+      <w:lvlText w:val="%1.%2"/>
+      <w:lvlJc w:val="left"/>
+      <w:pPr>
+        <w:ind w:left="576" w:hanging="576"/>
+      </w:pPr>
+      <w:rPr>
+        <w:rFonts w:hint="default"/>
+      </w:rPr>
+    </w:lvl>
+    <w:lvl w:ilvl="2">
+      <w:start w:val="1"/>
+      <w:numFmt w:val="decimal"/>
+      <w:pStyle w:val="Heading3"/>
+      <w:lvlText w:val="%1.%2.%3"/>
+      <w:lvlJc w:val="left"/>
+      <w:pPr>
+        <w:ind w:left="720" w:hanging="720"/>
+      </w:pPr>
+      <w:rPr>
+        <w:rFonts w:hint="default"/>
+      </w:rPr>
+    </w:lvl>
+    <w:lvl w:ilvl="3">
+      <w:start w:val="1"/>
+      <w:numFmt w:val="decimal"/>
+      <w:pStyle w:val="Heading4"/>
+      <w:lvlText w:val="%1.%2.%3.%4"/>
+      <w:lvlJc w:val="left"/>
+      <w:pPr>
+        <w:ind w:left="864" w:hanging="864"/>
+      </w:pPr>
+      <w:rPr>
+        <w:rFonts w:hint="default"/>
+      </w:rPr>
+    </w:lvl>
+    <w:lvl w:ilvl="4">
+      <w:start w:val="1"/>
+      <w:numFmt w:val="none"/>
+      <w:pStyle w:val="Heading5"/>
+      <w:lvlText w:val=""/>
+      <w:lvlJc w:val="left"/>
+      <w:pPr>
+        <w:ind w:left="0" w:firstLine="0"/>
+      </w:pPr>
+      <w:rPr>
+        <w:rFonts w:hint="default"/>
+      </w:rPr>
+    </w:lvl>
+    <w:lvl w:ilvl="5">
+      <w:start w:val="1"/>
+      <w:numFmt w:val="none"/>
+      <w:pStyle w:val="Heading6"/>
+      <w:lvlText w:val=""/>
+      <w:lvlJc w:val="left"/>
+      <w:pPr>
+        <w:ind w:left="1152" w:hanging="1152"/>
+      </w:pPr>
+      <w:rPr>
+        <w:rFonts w:hint="default"/>
+      </w:rPr>
+    </w:lvl>
+    <w:lvl w:ilvl="6">
+      <w:start w:val="1"/>
+      <w:numFmt w:val="none"/>
+      <w:pStyle w:val="Heading7"/>
+      <w:lvlText w:val=""/>
+      <w:lvlJc w:val="left"/>
+      <w:pPr>
+        <w:ind w:left="1296" w:hanging="1296"/>
+      </w:pPr>
+      <w:rPr>
+        <w:rFonts w:hint="default"/>
+      </w:rPr>
+    </w:lvl>
+    <w:lvl w:ilvl="7">
+      <w:start w:val="1"/>
+      <w:numFmt w:val="none"/>
+      <w:pStyle w:val="Heading8"/>
+      <w:lvlText w:val=""/>
+      <w:lvlJc w:val="left"/>
+      <w:pPr>
+        <w:ind w:left="1440" w:hanging="1440"/>
+      </w:pPr>
+      <w:rPr>
+        <w:rFonts w:hint="default"/>
+      </w:rPr>
+    </w:lvl>
+    <w:lvl w:ilvl="8">
+      <w:start w:val="1"/>
+      <w:numFmt w:val="none"/>
+      <w:pStyle w:val="Heading9"/>
+      <w:lvlText w:val=""/>
+      <w:lvlJc w:val="left"/>
+      <w:pPr>
+        <w:ind w:left="1584" w:hanging="1584"/>
+      </w:pPr>
+      <w:rPr>
+        <w:rFonts w:hint="default"/>
+      </w:rPr>
+    </w:lvl>
+  </w:abstractNum>
+  <w:num w:numId="1" w16cid:durableId="861286714">
+    <w:abstractNumId w:val="0"/>
+  </w:num>
+</w:numbering>
+</file>
+
 <file path=word/styles.xml><?xml version="1.0" encoding="utf-8"?>
-<w:styles xmlns:mc="http://schemas.openxmlformats.org/markup-compatibility/2006" xmlns:r="http://schemas.openxmlformats.org/officeDocument/2006/relationships" xmlns:w="http://schemas.openxmlformats.org/wordprocessingml/2006/main" xmlns:w14="http://schemas.microsoft.com/office/word/2010/wordml" xmlns:w15="http://schemas.microsoft.com/office/word/2012/wordml" xmlns:w16cex="http://schemas.microsoft.com/office/word/2018/wordml/cex" xmlns:w16cid="http://schemas.microsoft.com/office/word/2016/wordml/cid" xmlns:w16="http://schemas.microsoft.com/office/word/2018/wordml" xmlns:w16sdtdh="http://schemas.microsoft.com/office/word/2020/wordml/sdtdatahash" xmlns:w16sdtfl="http://schemas.microsoft.com/office/word/2024/wordml/sdtformatlock" xmlns:w16se="http://schemas.microsoft.com/office/word/2015/wordml/symex" xmlns:w16du="http://schemas.microsoft.com/office/word/2023/wordml/word16du" mc:Ignorable="w14 w15 w16se w16cid w16 w16cex w16sdtdh w16sdtfl w16du">
+<w:styles xmlns:mc="http://schemas.openxmlformats.org/markup-compatibility/2006" xmlns:r="http://schemas.openxmlformats.org/officeDocument/2006/relationships" xmlns:w="http://schemas.openxmlformats.org/wordprocessingml/2006/main" xmlns:w14="http://schemas.microsoft.com/office/word/2010/wordml" xmlns:w15="http://schemas.microsoft.com/office/word/2012/wordml" xmlns:w16cex="http://schemas.microsoft.com/office/word/2018/wordml/cex" xmlns:w16cid="http://schemas.microsoft.com/office/word/2016/wordml/cid" xmlns:w16="http://schemas.microsoft.com/office/word/2018/wordml" xmlns:w16du="http://schemas.microsoft.com/office/word/2023/wordml/word16du" xmlns:w16sdtdh="http://schemas.microsoft.com/office/word/2020/wordml/sdtdatahash" xmlns:w16sdtfl="http://schemas.microsoft.com/office/word/2024/wordml/sdtformatlock" xmlns:w16se="http://schemas.microsoft.com/office/word/2015/wordml/symex" mc:Ignorable="w14 w15 w16se w16cid w16 w16cex w16sdtdh w16sdtfl w16du">
   <w:docDefaults>
     <w:rPrDefault>
       <w:rPr>
@@ -461,6 +777,10 @@
   <w:style w:type="paragraph" w:default="1" w:styleId="Normal">
     <w:name w:val="Normal"/>
     <w:qFormat/>
+    <w:rsid w:val="009D2B4B"/>
+    <w:rPr>
+      <w:rFonts w:ascii="Times New Roman" w:hAnsi="Times New Roman"/>
+    </w:rPr>
   </w:style>
   <w:style w:type="paragraph" w:styleId="Heading1">
     <w:name w:val="heading 1"/>
@@ -473,6 +793,9 @@
     <w:pPr>
       <w:keepNext/>
       <w:keepLines/>
+      <w:numPr>
+        <w:numId w:val="1"/>
+      </w:numPr>
       <w:spacing w:before="360" w:after="80"/>
       <w:outlineLvl w:val="0"/>
     </w:pPr>
@@ -489,20 +812,23 @@
     <w:next w:val="Normal"/>
     <w:link w:val="Heading2Char"/>
     <w:uiPriority w:val="9"/>
-    <w:semiHidden/>
     <w:unhideWhenUsed/>
     <w:qFormat/>
-    <w:rsid w:val="001545D0"/>
+    <w:rsid w:val="009D2B4B"/>
     <w:pPr>
       <w:keepNext/>
       <w:keepLines/>
+      <w:numPr>
+        <w:ilvl w:val="1"/>
+        <w:numId w:val="1"/>
+      </w:numPr>
       <w:spacing w:before="160" w:after="80"/>
       <w:outlineLvl w:val="1"/>
     </w:pPr>
     <w:rPr>
       <w:rFonts w:asciiTheme="majorHAnsi" w:eastAsiaTheme="majorEastAsia" w:hAnsiTheme="majorHAnsi" w:cstheme="majorBidi"/>
       <w:color w:val="0F4761" w:themeColor="accent1" w:themeShade="BF"/>
-      <w:sz w:val="32"/>
+      <w:sz w:val="28"/>
       <w:szCs w:val="32"/>
     </w:rPr>
   </w:style>
@@ -519,6 +845,10 @@
     <w:pPr>
       <w:keepNext/>
       <w:keepLines/>
+      <w:numPr>
+        <w:ilvl w:val="2"/>
+        <w:numId w:val="1"/>
+      </w:numPr>
       <w:spacing w:before="160" w:after="80"/>
       <w:outlineLvl w:val="2"/>
     </w:pPr>
@@ -542,6 +872,10 @@
     <w:pPr>
       <w:keepNext/>
       <w:keepLines/>
+      <w:numPr>
+        <w:ilvl w:val="3"/>
+        <w:numId w:val="1"/>
+      </w:numPr>
       <w:spacing w:before="80" w:after="40"/>
       <w:outlineLvl w:val="3"/>
     </w:pPr>
@@ -558,13 +892,16 @@
     <w:next w:val="Normal"/>
     <w:link w:val="Heading5Char"/>
     <w:uiPriority w:val="9"/>
-    <w:semiHidden/>
     <w:unhideWhenUsed/>
     <w:qFormat/>
     <w:rsid w:val="001545D0"/>
     <w:pPr>
       <w:keepNext/>
       <w:keepLines/>
+      <w:numPr>
+        <w:ilvl w:val="4"/>
+        <w:numId w:val="1"/>
+      </w:numPr>
       <w:spacing w:before="80" w:after="40"/>
       <w:outlineLvl w:val="4"/>
     </w:pPr>
@@ -586,6 +923,10 @@
     <w:pPr>
       <w:keepNext/>
       <w:keepLines/>
+      <w:numPr>
+        <w:ilvl w:val="5"/>
+        <w:numId w:val="1"/>
+      </w:numPr>
       <w:spacing w:before="40" w:after="0"/>
       <w:outlineLvl w:val="5"/>
     </w:pPr>
@@ -609,6 +950,10 @@
     <w:pPr>
       <w:keepNext/>
       <w:keepLines/>
+      <w:numPr>
+        <w:ilvl w:val="6"/>
+        <w:numId w:val="1"/>
+      </w:numPr>
       <w:spacing w:before="40" w:after="0"/>
       <w:outlineLvl w:val="6"/>
     </w:pPr>
@@ -630,6 +975,10 @@
     <w:pPr>
       <w:keepNext/>
       <w:keepLines/>
+      <w:numPr>
+        <w:ilvl w:val="7"/>
+        <w:numId w:val="1"/>
+      </w:numPr>
       <w:spacing w:after="0"/>
       <w:outlineLvl w:val="7"/>
     </w:pPr>
@@ -653,6 +1002,10 @@
     <w:pPr>
       <w:keepNext/>
       <w:keepLines/>
+      <w:numPr>
+        <w:ilvl w:val="8"/>
+        <w:numId w:val="1"/>
+      </w:numPr>
       <w:spacing w:after="0"/>
       <w:outlineLvl w:val="8"/>
     </w:pPr>
@@ -706,12 +1059,11 @@
     <w:basedOn w:val="DefaultParagraphFont"/>
     <w:link w:val="Heading2"/>
     <w:uiPriority w:val="9"/>
-    <w:semiHidden/>
-    <w:rsid w:val="001545D0"/>
+    <w:rsid w:val="009D2B4B"/>
     <w:rPr>
       <w:rFonts w:asciiTheme="majorHAnsi" w:eastAsiaTheme="majorEastAsia" w:hAnsiTheme="majorHAnsi" w:cstheme="majorBidi"/>
       <w:color w:val="0F4761" w:themeColor="accent1" w:themeShade="BF"/>
-      <w:sz w:val="32"/>
+      <w:sz w:val="28"/>
       <w:szCs w:val="32"/>
     </w:rPr>
   </w:style>
@@ -748,7 +1100,6 @@
     <w:basedOn w:val="DefaultParagraphFont"/>
     <w:link w:val="Heading5"/>
     <w:uiPriority w:val="9"/>
-    <w:semiHidden/>
     <w:rsid w:val="001545D0"/>
     <w:rPr>
       <w:rFonts w:eastAsiaTheme="majorEastAsia" w:cstheme="majorBidi"/>
@@ -814,7 +1165,7 @@
     <w:link w:val="TitleChar"/>
     <w:uiPriority w:val="10"/>
     <w:qFormat/>
-    <w:rsid w:val="001545D0"/>
+    <w:rsid w:val="009D2B4B"/>
     <w:pPr>
       <w:spacing w:after="80" w:line="240" w:lineRule="auto"/>
       <w:contextualSpacing/>
@@ -823,7 +1174,7 @@
       <w:rFonts w:asciiTheme="majorHAnsi" w:eastAsiaTheme="majorEastAsia" w:hAnsiTheme="majorHAnsi" w:cstheme="majorBidi"/>
       <w:spacing w:val="-10"/>
       <w:kern w:val="28"/>
-      <w:sz w:val="56"/>
+      <w:sz w:val="44"/>
       <w:szCs w:val="56"/>
     </w:rPr>
   </w:style>
@@ -832,12 +1183,12 @@
     <w:basedOn w:val="DefaultParagraphFont"/>
     <w:link w:val="Title"/>
     <w:uiPriority w:val="10"/>
-    <w:rsid w:val="001545D0"/>
+    <w:rsid w:val="009D2B4B"/>
     <w:rPr>
       <w:rFonts w:asciiTheme="majorHAnsi" w:eastAsiaTheme="majorEastAsia" w:hAnsiTheme="majorHAnsi" w:cstheme="majorBidi"/>
       <w:spacing w:val="-10"/>
       <w:kern w:val="28"/>
-      <w:sz w:val="56"/>
+      <w:sz w:val="44"/>
       <w:szCs w:val="56"/>
     </w:rPr>
   </w:style>

</xml_diff>

<commit_message>
Started work on a shortcut to invoke tools menu.
</commit_message>
<xml_diff>
--- a/docs/SeagrassRestorationTools_UserManual.docx
+++ b/docs/SeagrassRestorationTools_UserManual.docx
@@ -106,6 +106,9 @@
       <w:r>
         <w:t xml:space="preserve"> repo.  Cloning from command line.</w:t>
       </w:r>
+      <w:r>
+        <w:t xml:space="preserve"> Home folder and nested folder structure with data (give home folder a label such as Seagrass Restoration project home folder).</w:t>
+      </w:r>
     </w:p>
     <w:p>
       <w:pPr>
@@ -136,51 +139,211 @@
         <w:pStyle w:val="Heading2"/>
       </w:pPr>
       <w:r>
-        <w:t>Adding R executable to the path</w:t>
-      </w:r>
-    </w:p>
-    <w:p>
-      <w:r>
-        <w:t>The t</w:t>
-      </w:r>
-      <w:r>
-        <w:t xml:space="preserve">ools can be used within RStudio without any preparation if the R code for the tools is within your current </w:t>
-      </w:r>
-      <w:r>
-        <w:t xml:space="preserve">RStudio </w:t>
-      </w:r>
-      <w:r>
-        <w:t xml:space="preserve">project folder </w:t>
-      </w:r>
-      <w:r>
-        <w:t xml:space="preserve">in a subfolder named “code”, </w:t>
-      </w:r>
-      <w:r>
-        <w:t>and the required packages are installed.  This approach does require opening the RStudio application.</w:t>
-      </w:r>
-    </w:p>
-    <w:p>
-      <w:r>
-        <w:t xml:space="preserve">The </w:t>
-      </w:r>
-      <w:proofErr w:type="gramStart"/>
-      <w:r>
-        <w:t>more lightweight</w:t>
-      </w:r>
-      <w:proofErr w:type="gramEnd"/>
-      <w:r>
-        <w:t xml:space="preserve"> alternative is to run the tools from a terminal</w:t>
-      </w:r>
-      <w:r>
-        <w:t xml:space="preserve">. Windows 11 has a terminal app that can be found in the Start menu or more directly in the Power User menu opened with keyboard shortcut </w:t>
+        <w:t>Create a desktop shortcut</w:t>
+      </w:r>
+    </w:p>
+    <w:p>
+      <w:r>
+        <w:t>Using a desktop shortcut is a very direct and efficient way to run the tools.  The steps to create a shortcut are described below.</w:t>
+      </w:r>
+    </w:p>
+    <w:p>
+      <w:r>
+        <w:t xml:space="preserve">An alternative is to open the RStudio development environment with the working directory set to the home folder of your Seagrass Restoration Project folder (either by opening an RStudio project with the same home folder, or by setting the location with </w:t>
       </w:r>
       <w:proofErr w:type="spellStart"/>
       <w:r>
-        <w:t>WindowKey</w:t>
+        <w:t>setwd</w:t>
       </w:r>
       <w:proofErr w:type="spellEnd"/>
       <w:r>
-        <w:t xml:space="preserve"> – X.</w:t>
+        <w:t>() ).</w:t>
+      </w:r>
+    </w:p>
+    <w:p>
+      <w:r>
+        <w:lastRenderedPageBreak/>
+        <w:drawing>
+          <wp:inline distT="0" distB="0" distL="0" distR="0" wp14:anchorId="4321463B" wp14:editId="1BCED85E">
+            <wp:extent cx="3656877" cy="2709901"/>
+            <wp:effectExtent l="0" t="0" r="1270" b="0"/>
+            <wp:docPr id="1903344459" name="Picture 1"/>
+            <wp:cNvGraphicFramePr>
+              <a:graphicFrameLocks xmlns:a="http://schemas.openxmlformats.org/drawingml/2006/main" noChangeAspect="1"/>
+            </wp:cNvGraphicFramePr>
+            <a:graphic xmlns:a="http://schemas.openxmlformats.org/drawingml/2006/main">
+              <a:graphicData uri="http://schemas.openxmlformats.org/drawingml/2006/picture">
+                <pic:pic xmlns:pic="http://schemas.openxmlformats.org/drawingml/2006/picture">
+                  <pic:nvPicPr>
+                    <pic:cNvPr id="1903344459" name=""/>
+                    <pic:cNvPicPr/>
+                  </pic:nvPicPr>
+                  <pic:blipFill>
+                    <a:blip r:embed="rId5"/>
+                    <a:stretch>
+                      <a:fillRect/>
+                    </a:stretch>
+                  </pic:blipFill>
+                  <pic:spPr>
+                    <a:xfrm>
+                      <a:off x="0" y="0"/>
+                      <a:ext cx="3665332" cy="2716167"/>
+                    </a:xfrm>
+                    <a:prstGeom prst="rect">
+                      <a:avLst/>
+                    </a:prstGeom>
+                  </pic:spPr>
+                </pic:pic>
+              </a:graphicData>
+            </a:graphic>
+          </wp:inline>
+        </w:drawing>
+      </w:r>
+    </w:p>
+    <w:p/>
+    <w:p>
+      <w:r>
+        <w:t xml:space="preserve">Rterm  --no-save -f  </w:t>
+      </w:r>
+      <w:proofErr w:type="spellStart"/>
+      <w:r>
+        <w:t>srtools.r</w:t>
+      </w:r>
+      <w:proofErr w:type="spellEnd"/>
+    </w:p>
+    <w:p/>
+    <w:p>
+      <w:r>
+        <w:drawing>
+          <wp:inline distT="0" distB="0" distL="0" distR="0" wp14:anchorId="25AC8AF1" wp14:editId="4EADE983">
+            <wp:extent cx="4617720" cy="987552"/>
+            <wp:effectExtent l="0" t="0" r="0" b="3175"/>
+            <wp:docPr id="1918842594" name="Picture 1"/>
+            <wp:cNvGraphicFramePr>
+              <a:graphicFrameLocks xmlns:a="http://schemas.openxmlformats.org/drawingml/2006/main" noChangeAspect="1"/>
+            </wp:cNvGraphicFramePr>
+            <a:graphic xmlns:a="http://schemas.openxmlformats.org/drawingml/2006/main">
+              <a:graphicData uri="http://schemas.openxmlformats.org/drawingml/2006/picture">
+                <pic:pic xmlns:pic="http://schemas.openxmlformats.org/drawingml/2006/picture">
+                  <pic:nvPicPr>
+                    <pic:cNvPr id="1918842594" name=""/>
+                    <pic:cNvPicPr/>
+                  </pic:nvPicPr>
+                  <pic:blipFill>
+                    <a:blip r:embed="rId6"/>
+                    <a:stretch>
+                      <a:fillRect/>
+                    </a:stretch>
+                  </pic:blipFill>
+                  <pic:spPr>
+                    <a:xfrm>
+                      <a:off x="0" y="0"/>
+                      <a:ext cx="4617720" cy="987552"/>
+                    </a:xfrm>
+                    <a:prstGeom prst="rect">
+                      <a:avLst/>
+                    </a:prstGeom>
+                  </pic:spPr>
+                </pic:pic>
+              </a:graphicData>
+            </a:graphic>
+          </wp:inline>
+        </w:drawing>
+      </w:r>
+    </w:p>
+    <w:p/>
+    <w:p/>
+    <w:p>
+      <w:r>
+        <w:drawing>
+          <wp:inline distT="0" distB="0" distL="0" distR="0" wp14:anchorId="06654CE4" wp14:editId="00E41B7D">
+            <wp:extent cx="4572000" cy="1097280"/>
+            <wp:effectExtent l="0" t="0" r="0" b="7620"/>
+            <wp:docPr id="1339868818" name="Picture 1"/>
+            <wp:cNvGraphicFramePr>
+              <a:graphicFrameLocks xmlns:a="http://schemas.openxmlformats.org/drawingml/2006/main" noChangeAspect="1"/>
+            </wp:cNvGraphicFramePr>
+            <a:graphic xmlns:a="http://schemas.openxmlformats.org/drawingml/2006/main">
+              <a:graphicData uri="http://schemas.openxmlformats.org/drawingml/2006/picture">
+                <pic:pic xmlns:pic="http://schemas.openxmlformats.org/drawingml/2006/picture">
+                  <pic:nvPicPr>
+                    <pic:cNvPr id="1339868818" name=""/>
+                    <pic:cNvPicPr/>
+                  </pic:nvPicPr>
+                  <pic:blipFill>
+                    <a:blip r:embed="rId7"/>
+                    <a:stretch>
+                      <a:fillRect/>
+                    </a:stretch>
+                  </pic:blipFill>
+                  <pic:spPr>
+                    <a:xfrm>
+                      <a:off x="0" y="0"/>
+                      <a:ext cx="4572000" cy="1097280"/>
+                    </a:xfrm>
+                    <a:prstGeom prst="rect">
+                      <a:avLst/>
+                    </a:prstGeom>
+                  </pic:spPr>
+                </pic:pic>
+              </a:graphicData>
+            </a:graphic>
+          </wp:inline>
+        </w:drawing>
+      </w:r>
+    </w:p>
+    <w:p/>
+    <w:p>
+      <w:r>
+        <w:drawing>
+          <wp:inline distT="0" distB="0" distL="0" distR="0" wp14:anchorId="16B99AA5" wp14:editId="033D6B2F">
+            <wp:extent cx="5943600" cy="610870"/>
+            <wp:effectExtent l="0" t="0" r="0" b="0"/>
+            <wp:docPr id="1693156245" name="Picture 1"/>
+            <wp:cNvGraphicFramePr>
+              <a:graphicFrameLocks xmlns:a="http://schemas.openxmlformats.org/drawingml/2006/main" noChangeAspect="1"/>
+            </wp:cNvGraphicFramePr>
+            <a:graphic xmlns:a="http://schemas.openxmlformats.org/drawingml/2006/main">
+              <a:graphicData uri="http://schemas.openxmlformats.org/drawingml/2006/picture">
+                <pic:pic xmlns:pic="http://schemas.openxmlformats.org/drawingml/2006/picture">
+                  <pic:nvPicPr>
+                    <pic:cNvPr id="1693156245" name=""/>
+                    <pic:cNvPicPr/>
+                  </pic:nvPicPr>
+                  <pic:blipFill>
+                    <a:blip r:embed="rId8"/>
+                    <a:stretch>
+                      <a:fillRect/>
+                    </a:stretch>
+                  </pic:blipFill>
+                  <pic:spPr>
+                    <a:xfrm>
+                      <a:off x="0" y="0"/>
+                      <a:ext cx="5943600" cy="610870"/>
+                    </a:xfrm>
+                    <a:prstGeom prst="rect">
+                      <a:avLst/>
+                    </a:prstGeom>
+                  </pic:spPr>
+                </pic:pic>
+              </a:graphicData>
+            </a:graphic>
+          </wp:inline>
+        </w:drawing>
+      </w:r>
+    </w:p>
+    <w:p>
+      <w:r>
+        <w:lastRenderedPageBreak/>
+        <w:t>“C:\Users\pdow490\AppData\Local\Programs\R\R-4.5.3\bin\x64\Rterm.exe”  --no-save -f  “C:\Users\pdow490\OneDrive - Washington State Executive Branch Agencies\projects\seagrass_restoration_data_2026\code\</w:t>
+      </w:r>
+      <w:proofErr w:type="spellStart"/>
+      <w:r>
+        <w:t>srtools.r</w:t>
+      </w:r>
+      <w:proofErr w:type="spellEnd"/>
+      <w:r>
+        <w:t xml:space="preserve">”       </w:t>
       </w:r>
     </w:p>
     <w:p>
@@ -220,7 +383,6 @@
     </w:p>
     <w:p>
       <w:r>
-        <w:lastRenderedPageBreak/>
         <w:t>Add this location to your path</w:t>
       </w:r>
     </w:p>
@@ -1422,6 +1584,29 @@
       <w:spacing w:val="5"/>
     </w:rPr>
   </w:style>
+  <w:style w:type="character" w:styleId="Hyperlink">
+    <w:name w:val="Hyperlink"/>
+    <w:basedOn w:val="DefaultParagraphFont"/>
+    <w:uiPriority w:val="99"/>
+    <w:unhideWhenUsed/>
+    <w:rsid w:val="00BD5A62"/>
+    <w:rPr>
+      <w:color w:val="467886" w:themeColor="hyperlink"/>
+      <w:u w:val="single"/>
+    </w:rPr>
+  </w:style>
+  <w:style w:type="character" w:styleId="UnresolvedMention">
+    <w:name w:val="Unresolved Mention"/>
+    <w:basedOn w:val="DefaultParagraphFont"/>
+    <w:uiPriority w:val="99"/>
+    <w:semiHidden/>
+    <w:unhideWhenUsed/>
+    <w:rsid w:val="00BD5A62"/>
+    <w:rPr>
+      <w:color w:val="605E5C"/>
+      <w:shd w:val="clear" w:color="auto" w:fill="E1DFDD"/>
+    </w:rPr>
+  </w:style>
 </w:styles>
 </file>
 

</xml_diff>

<commit_message>
Now graphing all locations. Investigated scale warning. Not scale, possibly NA
</commit_message>
<xml_diff>
--- a/docs/SeagrassRestorationTools_UserManual.docx
+++ b/docs/SeagrassRestorationTools_UserManual.docx
@@ -91,7 +91,61 @@
         <w:pStyle w:val="Heading2"/>
       </w:pPr>
       <w:r>
-        <w:t>Get the code</w:t>
+        <w:t>Clone the repository</w:t>
+      </w:r>
+    </w:p>
+    <w:p>
+      <w:r>
+        <w:t xml:space="preserve">Cloning the </w:t>
+      </w:r>
+      <w:proofErr w:type="spellStart"/>
+      <w:r>
+        <w:t>Github</w:t>
+      </w:r>
+      <w:proofErr w:type="spellEnd"/>
+      <w:r>
+        <w:t xml:space="preserve"> repository gives you on your local computer file system the following:</w:t>
+      </w:r>
+    </w:p>
+    <w:p>
+      <w:pPr>
+        <w:pStyle w:val="ListParagraph"/>
+        <w:numPr>
+          <w:ilvl w:val="0"/>
+          <w:numId w:val="2"/>
+        </w:numPr>
+      </w:pPr>
+      <w:r>
+        <w:t xml:space="preserve">R code that makes up the </w:t>
+      </w:r>
+      <w:proofErr w:type="spellStart"/>
+      <w:r>
+        <w:t>SRTools</w:t>
+      </w:r>
+      <w:proofErr w:type="spellEnd"/>
+    </w:p>
+    <w:p>
+      <w:pPr>
+        <w:pStyle w:val="ListParagraph"/>
+        <w:numPr>
+          <w:ilvl w:val="0"/>
+          <w:numId w:val="2"/>
+        </w:numPr>
+      </w:pPr>
+      <w:r>
+        <w:t>Project directory structure – the project home holder is both a git repository and an RStudio project home directory.</w:t>
+      </w:r>
+    </w:p>
+    <w:p>
+      <w:pPr>
+        <w:pStyle w:val="ListParagraph"/>
+        <w:numPr>
+          <w:ilvl w:val="0"/>
+          <w:numId w:val="2"/>
+        </w:numPr>
+      </w:pPr>
+      <w:r>
+        <w:t xml:space="preserve">An ArcGIS Pro 3.5.5 project that includes a </w:t>
       </w:r>
     </w:p>
     <w:p>
@@ -133,6 +187,26 @@
         <w:t xml:space="preserve"> from R console</w:t>
       </w:r>
     </w:p>
+    <w:p>
+      <w:r>
+        <w:t xml:space="preserve">The code does not check for package installation.  If packages are not installed, </w:t>
+      </w:r>
+      <w:r>
+        <w:t xml:space="preserve">the first </w:t>
+      </w:r>
+      <w:r>
+        <w:t xml:space="preserve">attempt to use </w:t>
+      </w:r>
+      <w:r>
+        <w:t>a missing package</w:t>
+      </w:r>
+      <w:r>
+        <w:t xml:space="preserve"> leads t</w:t>
+      </w:r>
+      <w:r>
+        <w:t>he running script to crash with an R system message on the console about the specific missing package.</w:t>
+      </w:r>
+    </w:p>
     <w:p/>
     <w:p>
       <w:pPr>
@@ -149,6 +223,7 @@
     </w:p>
     <w:p>
       <w:r>
+        <w:lastRenderedPageBreak/>
         <w:t xml:space="preserve">An alternative is to open the RStudio development environment with the working directory set to the home folder of your Seagrass Restoration Project folder (either by opening an RStudio project with the same home folder, or by setting the location with </w:t>
       </w:r>
       <w:proofErr w:type="spellStart"/>
@@ -162,7 +237,9 @@
     </w:p>
     <w:p>
       <w:r>
-        <w:lastRenderedPageBreak/>
+        <w:rPr>
+          <w:noProof/>
+        </w:rPr>
         <w:drawing>
           <wp:inline distT="0" distB="0" distL="0" distR="0" wp14:anchorId="4321463B" wp14:editId="1BCED85E">
             <wp:extent cx="3656877" cy="2709901"/>
@@ -214,6 +291,9 @@
     <w:p/>
     <w:p>
       <w:r>
+        <w:rPr>
+          <w:noProof/>
+        </w:rPr>
         <w:drawing>
           <wp:inline distT="0" distB="0" distL="0" distR="0" wp14:anchorId="25AC8AF1" wp14:editId="4EADE983">
             <wp:extent cx="4617720" cy="987552"/>
@@ -255,6 +335,9 @@
     <w:p/>
     <w:p>
       <w:r>
+        <w:rPr>
+          <w:noProof/>
+        </w:rPr>
         <w:drawing>
           <wp:inline distT="0" distB="0" distL="0" distR="0" wp14:anchorId="06654CE4" wp14:editId="00E41B7D">
             <wp:extent cx="4572000" cy="1097280"/>
@@ -295,6 +378,10 @@
     <w:p/>
     <w:p>
       <w:r>
+        <w:rPr>
+          <w:noProof/>
+        </w:rPr>
+        <w:lastRenderedPageBreak/>
         <w:drawing>
           <wp:inline distT="0" distB="0" distL="0" distR="0" wp14:anchorId="16B99AA5" wp14:editId="033D6B2F">
             <wp:extent cx="5943600" cy="610870"/>
@@ -334,7 +421,6 @@
     </w:p>
     <w:p>
       <w:r>
-        <w:lastRenderedPageBreak/>
         <w:t>“C:\Users\pdow490\AppData\Local\Programs\R\R-4.5.3\bin\x64\Rterm.exe”  --no-save -f  “C:\Users\pdow490\OneDrive - Washington State Executive Branch Agencies\projects\seagrass_restoration_data_2026\code\</w:t>
       </w:r>
       <w:proofErr w:type="spellStart"/>
@@ -455,22 +541,33 @@
       </w:r>
     </w:p>
     <w:p/>
-    <w:p/>
-    <w:p>
-      <w:pPr>
-        <w:pStyle w:val="Heading1"/>
-      </w:pPr>
-      <w:r>
-        <w:t>Use of tools</w:t>
+    <w:p>
+      <w:pPr>
+        <w:pStyle w:val="Heading2"/>
+      </w:pPr>
+      <w:r>
+        <w:t>Setup on ArcGIS Online</w:t>
       </w:r>
     </w:p>
     <w:p/>
     <w:p/>
+    <w:p/>
+    <w:p/>
     <w:p>
       <w:pPr>
         <w:pStyle w:val="Heading1"/>
       </w:pPr>
       <w:r>
+        <w:t>Use of tools</w:t>
+      </w:r>
+    </w:p>
+    <w:p/>
+    <w:p/>
+    <w:p>
+      <w:pPr>
+        <w:pStyle w:val="Heading1"/>
+      </w:pPr>
+      <w:r>
         <w:t>Appendices</w:t>
       </w:r>
     </w:p>
@@ -489,7 +586,11 @@
     </w:p>
     <w:p>
       <w:r>
+        <w:lastRenderedPageBreak/>
         <w:t>Code Structure</w:t>
+      </w:r>
+      <w:r>
+        <w:t xml:space="preserve"> and home directory structure</w:t>
       </w:r>
     </w:p>
     <w:sectPr>
@@ -626,8 +727,124 @@
       </w:rPr>
     </w:lvl>
   </w:abstractNum>
+  <w:abstractNum w:abstractNumId="1" w15:restartNumberingAfterBreak="0">
+    <w:nsid w:val="5EAF3094"/>
+    <w:multiLevelType w:val="hybridMultilevel"/>
+    <w:tmpl w:val="AAA2A910"/>
+    <w:lvl w:ilvl="0" w:tplc="04090001">
+      <w:start w:val="1"/>
+      <w:numFmt w:val="bullet"/>
+      <w:lvlText w:val=""/>
+      <w:lvlJc w:val="left"/>
+      <w:pPr>
+        <w:ind w:left="720" w:hanging="360"/>
+      </w:pPr>
+      <w:rPr>
+        <w:rFonts w:ascii="Symbol" w:hAnsi="Symbol" w:hint="default"/>
+      </w:rPr>
+    </w:lvl>
+    <w:lvl w:ilvl="1" w:tplc="04090003" w:tentative="1">
+      <w:start w:val="1"/>
+      <w:numFmt w:val="bullet"/>
+      <w:lvlText w:val="o"/>
+      <w:lvlJc w:val="left"/>
+      <w:pPr>
+        <w:ind w:left="1440" w:hanging="360"/>
+      </w:pPr>
+      <w:rPr>
+        <w:rFonts w:ascii="Courier New" w:hAnsi="Courier New" w:cs="Courier New" w:hint="default"/>
+      </w:rPr>
+    </w:lvl>
+    <w:lvl w:ilvl="2" w:tplc="04090005" w:tentative="1">
+      <w:start w:val="1"/>
+      <w:numFmt w:val="bullet"/>
+      <w:lvlText w:val=""/>
+      <w:lvlJc w:val="left"/>
+      <w:pPr>
+        <w:ind w:left="2160" w:hanging="360"/>
+      </w:pPr>
+      <w:rPr>
+        <w:rFonts w:ascii="Wingdings" w:hAnsi="Wingdings" w:hint="default"/>
+      </w:rPr>
+    </w:lvl>
+    <w:lvl w:ilvl="3" w:tplc="04090001" w:tentative="1">
+      <w:start w:val="1"/>
+      <w:numFmt w:val="bullet"/>
+      <w:lvlText w:val=""/>
+      <w:lvlJc w:val="left"/>
+      <w:pPr>
+        <w:ind w:left="2880" w:hanging="360"/>
+      </w:pPr>
+      <w:rPr>
+        <w:rFonts w:ascii="Symbol" w:hAnsi="Symbol" w:hint="default"/>
+      </w:rPr>
+    </w:lvl>
+    <w:lvl w:ilvl="4" w:tplc="04090003" w:tentative="1">
+      <w:start w:val="1"/>
+      <w:numFmt w:val="bullet"/>
+      <w:lvlText w:val="o"/>
+      <w:lvlJc w:val="left"/>
+      <w:pPr>
+        <w:ind w:left="3600" w:hanging="360"/>
+      </w:pPr>
+      <w:rPr>
+        <w:rFonts w:ascii="Courier New" w:hAnsi="Courier New" w:cs="Courier New" w:hint="default"/>
+      </w:rPr>
+    </w:lvl>
+    <w:lvl w:ilvl="5" w:tplc="04090005" w:tentative="1">
+      <w:start w:val="1"/>
+      <w:numFmt w:val="bullet"/>
+      <w:lvlText w:val=""/>
+      <w:lvlJc w:val="left"/>
+      <w:pPr>
+        <w:ind w:left="4320" w:hanging="360"/>
+      </w:pPr>
+      <w:rPr>
+        <w:rFonts w:ascii="Wingdings" w:hAnsi="Wingdings" w:hint="default"/>
+      </w:rPr>
+    </w:lvl>
+    <w:lvl w:ilvl="6" w:tplc="04090001" w:tentative="1">
+      <w:start w:val="1"/>
+      <w:numFmt w:val="bullet"/>
+      <w:lvlText w:val=""/>
+      <w:lvlJc w:val="left"/>
+      <w:pPr>
+        <w:ind w:left="5040" w:hanging="360"/>
+      </w:pPr>
+      <w:rPr>
+        <w:rFonts w:ascii="Symbol" w:hAnsi="Symbol" w:hint="default"/>
+      </w:rPr>
+    </w:lvl>
+    <w:lvl w:ilvl="7" w:tplc="04090003" w:tentative="1">
+      <w:start w:val="1"/>
+      <w:numFmt w:val="bullet"/>
+      <w:lvlText w:val="o"/>
+      <w:lvlJc w:val="left"/>
+      <w:pPr>
+        <w:ind w:left="5760" w:hanging="360"/>
+      </w:pPr>
+      <w:rPr>
+        <w:rFonts w:ascii="Courier New" w:hAnsi="Courier New" w:cs="Courier New" w:hint="default"/>
+      </w:rPr>
+    </w:lvl>
+    <w:lvl w:ilvl="8" w:tplc="04090005" w:tentative="1">
+      <w:start w:val="1"/>
+      <w:numFmt w:val="bullet"/>
+      <w:lvlText w:val=""/>
+      <w:lvlJc w:val="left"/>
+      <w:pPr>
+        <w:ind w:left="6480" w:hanging="360"/>
+      </w:pPr>
+      <w:rPr>
+        <w:rFonts w:ascii="Wingdings" w:hAnsi="Wingdings" w:hint="default"/>
+      </w:rPr>
+    </w:lvl>
+  </w:abstractNum>
   <w:num w:numId="1" w16cid:durableId="861286714">
     <w:abstractNumId w:val="0"/>
+  </w:num>
+  <w:num w:numId="2" w16cid:durableId="1476871348">
+    <w:abstractNumId w:val="1"/>
   </w:num>
 </w:numbering>
 </file>

</xml_diff>

<commit_message>
Corrected symbology in monitoring graphs. Started notes on data entry.
</commit_message>
<xml_diff>
--- a/docs/SeagrassRestorationTools_UserManual.docx
+++ b/docs/SeagrassRestorationTools_UserManual.docx
@@ -13,11 +13,908 @@
     <w:p/>
     <w:p>
       <w:pPr>
+        <w:pStyle w:val="TOC1"/>
+        <w:tabs>
+          <w:tab w:val="right" w:leader="dot" w:pos="9350"/>
+        </w:tabs>
+        <w:rPr>
+          <w:rFonts w:eastAsiaTheme="minorEastAsia"/>
+          <w:b w:val="0"/>
+          <w:bCs w:val="0"/>
+          <w:caps w:val="0"/>
+          <w:noProof/>
+          <w:sz w:val="24"/>
+          <w:szCs w:val="24"/>
+        </w:rPr>
+      </w:pPr>
+      <w:r>
+        <w:fldChar w:fldCharType="begin"/>
+      </w:r>
+      <w:r>
+        <w:instrText xml:space="preserve"> TOC \o "1-3" \h \z \u \t "Heading 5,1" </w:instrText>
+      </w:r>
+      <w:r>
+        <w:fldChar w:fldCharType="separate"/>
+      </w:r>
+      <w:hyperlink w:anchor="_Toc237512872" w:history="1">
+        <w:r>
+          <w:rPr>
+            <w:rStyle w:val="Hyperlink"/>
+            <w:noProof/>
+          </w:rPr>
+          <w:t>version notes</w:t>
+        </w:r>
+        <w:r>
+          <w:rPr>
+            <w:noProof/>
+            <w:webHidden/>
+          </w:rPr>
+          <w:tab/>
+        </w:r>
+        <w:r>
+          <w:rPr>
+            <w:noProof/>
+            <w:webHidden/>
+          </w:rPr>
+          <w:fldChar w:fldCharType="begin"/>
+        </w:r>
+        <w:r>
+          <w:rPr>
+            <w:noProof/>
+            <w:webHidden/>
+          </w:rPr>
+          <w:instrText xml:space="preserve"> PAGEREF _Toc237512872 \h </w:instrText>
+        </w:r>
+        <w:r>
+          <w:rPr>
+            <w:noProof/>
+            <w:webHidden/>
+          </w:rPr>
+        </w:r>
+        <w:r>
+          <w:rPr>
+            <w:noProof/>
+            <w:webHidden/>
+          </w:rPr>
+          <w:fldChar w:fldCharType="separate"/>
+        </w:r>
+        <w:r>
+          <w:rPr>
+            <w:noProof/>
+            <w:webHidden/>
+          </w:rPr>
+          <w:t>1</w:t>
+        </w:r>
+        <w:r>
+          <w:rPr>
+            <w:noProof/>
+            <w:webHidden/>
+          </w:rPr>
+          <w:fldChar w:fldCharType="end"/>
+        </w:r>
+      </w:hyperlink>
+    </w:p>
+    <w:p>
+      <w:pPr>
+        <w:pStyle w:val="TOC1"/>
+        <w:tabs>
+          <w:tab w:val="right" w:leader="dot" w:pos="9350"/>
+        </w:tabs>
+        <w:rPr>
+          <w:rFonts w:eastAsiaTheme="minorEastAsia"/>
+          <w:b w:val="0"/>
+          <w:bCs w:val="0"/>
+          <w:caps w:val="0"/>
+          <w:noProof/>
+          <w:sz w:val="24"/>
+          <w:szCs w:val="24"/>
+        </w:rPr>
+      </w:pPr>
+      <w:hyperlink w:anchor="_Toc237512873" w:history="1">
+        <w:r>
+          <w:rPr>
+            <w:rStyle w:val="Hyperlink"/>
+            <w:noProof/>
+          </w:rPr>
+          <w:t>purpose of tools / purpose of manual</w:t>
+        </w:r>
+        <w:r>
+          <w:rPr>
+            <w:noProof/>
+            <w:webHidden/>
+          </w:rPr>
+          <w:tab/>
+        </w:r>
+        <w:r>
+          <w:rPr>
+            <w:noProof/>
+            <w:webHidden/>
+          </w:rPr>
+          <w:fldChar w:fldCharType="begin"/>
+        </w:r>
+        <w:r>
+          <w:rPr>
+            <w:noProof/>
+            <w:webHidden/>
+          </w:rPr>
+          <w:instrText xml:space="preserve"> PAGEREF _Toc237512873 \h </w:instrText>
+        </w:r>
+        <w:r>
+          <w:rPr>
+            <w:noProof/>
+            <w:webHidden/>
+          </w:rPr>
+        </w:r>
+        <w:r>
+          <w:rPr>
+            <w:noProof/>
+            <w:webHidden/>
+          </w:rPr>
+          <w:fldChar w:fldCharType="separate"/>
+        </w:r>
+        <w:r>
+          <w:rPr>
+            <w:noProof/>
+            <w:webHidden/>
+          </w:rPr>
+          <w:t>1</w:t>
+        </w:r>
+        <w:r>
+          <w:rPr>
+            <w:noProof/>
+            <w:webHidden/>
+          </w:rPr>
+          <w:fldChar w:fldCharType="end"/>
+        </w:r>
+      </w:hyperlink>
+    </w:p>
+    <w:p>
+      <w:pPr>
+        <w:pStyle w:val="TOC1"/>
+        <w:tabs>
+          <w:tab w:val="left" w:pos="480"/>
+          <w:tab w:val="right" w:leader="dot" w:pos="9350"/>
+        </w:tabs>
+        <w:rPr>
+          <w:rFonts w:eastAsiaTheme="minorEastAsia"/>
+          <w:b w:val="0"/>
+          <w:bCs w:val="0"/>
+          <w:caps w:val="0"/>
+          <w:noProof/>
+          <w:sz w:val="24"/>
+          <w:szCs w:val="24"/>
+        </w:rPr>
+      </w:pPr>
+      <w:hyperlink w:anchor="_Toc237512874" w:history="1">
+        <w:r>
+          <w:rPr>
+            <w:rStyle w:val="Hyperlink"/>
+            <w:noProof/>
+          </w:rPr>
+          <w:t>2</w:t>
+        </w:r>
+        <w:r>
+          <w:rPr>
+            <w:rFonts w:eastAsiaTheme="minorEastAsia"/>
+            <w:b w:val="0"/>
+            <w:bCs w:val="0"/>
+            <w:caps w:val="0"/>
+            <w:noProof/>
+            <w:sz w:val="24"/>
+            <w:szCs w:val="24"/>
+          </w:rPr>
+          <w:tab/>
+        </w:r>
+        <w:r>
+          <w:rPr>
+            <w:rStyle w:val="Hyperlink"/>
+            <w:noProof/>
+          </w:rPr>
+          <w:t>Setup –how to prepare to use</w:t>
+        </w:r>
+        <w:r>
+          <w:rPr>
+            <w:noProof/>
+            <w:webHidden/>
+          </w:rPr>
+          <w:tab/>
+        </w:r>
+        <w:r>
+          <w:rPr>
+            <w:noProof/>
+            <w:webHidden/>
+          </w:rPr>
+          <w:fldChar w:fldCharType="begin"/>
+        </w:r>
+        <w:r>
+          <w:rPr>
+            <w:noProof/>
+            <w:webHidden/>
+          </w:rPr>
+          <w:instrText xml:space="preserve"> PAGEREF _Toc237512874 \h </w:instrText>
+        </w:r>
+        <w:r>
+          <w:rPr>
+            <w:noProof/>
+            <w:webHidden/>
+          </w:rPr>
+        </w:r>
+        <w:r>
+          <w:rPr>
+            <w:noProof/>
+            <w:webHidden/>
+          </w:rPr>
+          <w:fldChar w:fldCharType="separate"/>
+        </w:r>
+        <w:r>
+          <w:rPr>
+            <w:noProof/>
+            <w:webHidden/>
+          </w:rPr>
+          <w:t>1</w:t>
+        </w:r>
+        <w:r>
+          <w:rPr>
+            <w:noProof/>
+            <w:webHidden/>
+          </w:rPr>
+          <w:fldChar w:fldCharType="end"/>
+        </w:r>
+      </w:hyperlink>
+    </w:p>
+    <w:p>
+      <w:pPr>
+        <w:pStyle w:val="TOC2"/>
+        <w:tabs>
+          <w:tab w:val="left" w:pos="960"/>
+          <w:tab w:val="right" w:leader="dot" w:pos="9350"/>
+        </w:tabs>
+        <w:rPr>
+          <w:rFonts w:eastAsiaTheme="minorEastAsia"/>
+          <w:smallCaps w:val="0"/>
+          <w:noProof/>
+          <w:sz w:val="24"/>
+          <w:szCs w:val="24"/>
+        </w:rPr>
+      </w:pPr>
+      <w:hyperlink w:anchor="_Toc237512875" w:history="1">
+        <w:r>
+          <w:rPr>
+            <w:rStyle w:val="Hyperlink"/>
+            <w:noProof/>
+          </w:rPr>
+          <w:t>2.1</w:t>
+        </w:r>
+        <w:r>
+          <w:rPr>
+            <w:rFonts w:eastAsiaTheme="minorEastAsia"/>
+            <w:smallCaps w:val="0"/>
+            <w:noProof/>
+            <w:sz w:val="24"/>
+            <w:szCs w:val="24"/>
+          </w:rPr>
+          <w:tab/>
+        </w:r>
+        <w:r>
+          <w:rPr>
+            <w:rStyle w:val="Hyperlink"/>
+            <w:noProof/>
+          </w:rPr>
+          <w:t>Clone the repository</w:t>
+        </w:r>
+        <w:r>
+          <w:rPr>
+            <w:noProof/>
+            <w:webHidden/>
+          </w:rPr>
+          <w:tab/>
+        </w:r>
+        <w:r>
+          <w:rPr>
+            <w:noProof/>
+            <w:webHidden/>
+          </w:rPr>
+          <w:fldChar w:fldCharType="begin"/>
+        </w:r>
+        <w:r>
+          <w:rPr>
+            <w:noProof/>
+            <w:webHidden/>
+          </w:rPr>
+          <w:instrText xml:space="preserve"> PAGEREF _Toc237512875 \h </w:instrText>
+        </w:r>
+        <w:r>
+          <w:rPr>
+            <w:noProof/>
+            <w:webHidden/>
+          </w:rPr>
+        </w:r>
+        <w:r>
+          <w:rPr>
+            <w:noProof/>
+            <w:webHidden/>
+          </w:rPr>
+          <w:fldChar w:fldCharType="separate"/>
+        </w:r>
+        <w:r>
+          <w:rPr>
+            <w:noProof/>
+            <w:webHidden/>
+          </w:rPr>
+          <w:t>1</w:t>
+        </w:r>
+        <w:r>
+          <w:rPr>
+            <w:noProof/>
+            <w:webHidden/>
+          </w:rPr>
+          <w:fldChar w:fldCharType="end"/>
+        </w:r>
+      </w:hyperlink>
+    </w:p>
+    <w:p>
+      <w:pPr>
+        <w:pStyle w:val="TOC2"/>
+        <w:tabs>
+          <w:tab w:val="left" w:pos="960"/>
+          <w:tab w:val="right" w:leader="dot" w:pos="9350"/>
+        </w:tabs>
+        <w:rPr>
+          <w:rFonts w:eastAsiaTheme="minorEastAsia"/>
+          <w:smallCaps w:val="0"/>
+          <w:noProof/>
+          <w:sz w:val="24"/>
+          <w:szCs w:val="24"/>
+        </w:rPr>
+      </w:pPr>
+      <w:hyperlink w:anchor="_Toc237512876" w:history="1">
+        <w:r>
+          <w:rPr>
+            <w:rStyle w:val="Hyperlink"/>
+            <w:noProof/>
+          </w:rPr>
+          <w:t>2.2</w:t>
+        </w:r>
+        <w:r>
+          <w:rPr>
+            <w:rFonts w:eastAsiaTheme="minorEastAsia"/>
+            <w:smallCaps w:val="0"/>
+            <w:noProof/>
+            <w:sz w:val="24"/>
+            <w:szCs w:val="24"/>
+          </w:rPr>
+          <w:tab/>
+        </w:r>
+        <w:r>
+          <w:rPr>
+            <w:rStyle w:val="Hyperlink"/>
+            <w:noProof/>
+          </w:rPr>
+          <w:t>Install required packages</w:t>
+        </w:r>
+        <w:r>
+          <w:rPr>
+            <w:noProof/>
+            <w:webHidden/>
+          </w:rPr>
+          <w:tab/>
+        </w:r>
+        <w:r>
+          <w:rPr>
+            <w:noProof/>
+            <w:webHidden/>
+          </w:rPr>
+          <w:fldChar w:fldCharType="begin"/>
+        </w:r>
+        <w:r>
+          <w:rPr>
+            <w:noProof/>
+            <w:webHidden/>
+          </w:rPr>
+          <w:instrText xml:space="preserve"> PAGEREF _Toc237512876 \h </w:instrText>
+        </w:r>
+        <w:r>
+          <w:rPr>
+            <w:noProof/>
+            <w:webHidden/>
+          </w:rPr>
+        </w:r>
+        <w:r>
+          <w:rPr>
+            <w:noProof/>
+            <w:webHidden/>
+          </w:rPr>
+          <w:fldChar w:fldCharType="separate"/>
+        </w:r>
+        <w:r>
+          <w:rPr>
+            <w:noProof/>
+            <w:webHidden/>
+          </w:rPr>
+          <w:t>2</w:t>
+        </w:r>
+        <w:r>
+          <w:rPr>
+            <w:noProof/>
+            <w:webHidden/>
+          </w:rPr>
+          <w:fldChar w:fldCharType="end"/>
+        </w:r>
+      </w:hyperlink>
+    </w:p>
+    <w:p>
+      <w:pPr>
+        <w:pStyle w:val="TOC2"/>
+        <w:tabs>
+          <w:tab w:val="left" w:pos="960"/>
+          <w:tab w:val="right" w:leader="dot" w:pos="9350"/>
+        </w:tabs>
+        <w:rPr>
+          <w:rFonts w:eastAsiaTheme="minorEastAsia"/>
+          <w:smallCaps w:val="0"/>
+          <w:noProof/>
+          <w:sz w:val="24"/>
+          <w:szCs w:val="24"/>
+        </w:rPr>
+      </w:pPr>
+      <w:hyperlink w:anchor="_Toc237512877" w:history="1">
+        <w:r>
+          <w:rPr>
+            <w:rStyle w:val="Hyperlink"/>
+            <w:noProof/>
+          </w:rPr>
+          <w:t>2.3</w:t>
+        </w:r>
+        <w:r>
+          <w:rPr>
+            <w:rFonts w:eastAsiaTheme="minorEastAsia"/>
+            <w:smallCaps w:val="0"/>
+            <w:noProof/>
+            <w:sz w:val="24"/>
+            <w:szCs w:val="24"/>
+          </w:rPr>
+          <w:tab/>
+        </w:r>
+        <w:r>
+          <w:rPr>
+            <w:rStyle w:val="Hyperlink"/>
+            <w:noProof/>
+          </w:rPr>
+          <w:t>Create a desktop shortcut</w:t>
+        </w:r>
+        <w:r>
+          <w:rPr>
+            <w:noProof/>
+            <w:webHidden/>
+          </w:rPr>
+          <w:tab/>
+        </w:r>
+        <w:r>
+          <w:rPr>
+            <w:noProof/>
+            <w:webHidden/>
+          </w:rPr>
+          <w:fldChar w:fldCharType="begin"/>
+        </w:r>
+        <w:r>
+          <w:rPr>
+            <w:noProof/>
+            <w:webHidden/>
+          </w:rPr>
+          <w:instrText xml:space="preserve"> PAGEREF _Toc237512877 \h </w:instrText>
+        </w:r>
+        <w:r>
+          <w:rPr>
+            <w:noProof/>
+            <w:webHidden/>
+          </w:rPr>
+        </w:r>
+        <w:r>
+          <w:rPr>
+            <w:noProof/>
+            <w:webHidden/>
+          </w:rPr>
+          <w:fldChar w:fldCharType="separate"/>
+        </w:r>
+        <w:r>
+          <w:rPr>
+            <w:noProof/>
+            <w:webHidden/>
+          </w:rPr>
+          <w:t>2</w:t>
+        </w:r>
+        <w:r>
+          <w:rPr>
+            <w:noProof/>
+            <w:webHidden/>
+          </w:rPr>
+          <w:fldChar w:fldCharType="end"/>
+        </w:r>
+      </w:hyperlink>
+    </w:p>
+    <w:p>
+      <w:pPr>
+        <w:pStyle w:val="TOC2"/>
+        <w:tabs>
+          <w:tab w:val="left" w:pos="960"/>
+          <w:tab w:val="right" w:leader="dot" w:pos="9350"/>
+        </w:tabs>
+        <w:rPr>
+          <w:rFonts w:eastAsiaTheme="minorEastAsia"/>
+          <w:smallCaps w:val="0"/>
+          <w:noProof/>
+          <w:sz w:val="24"/>
+          <w:szCs w:val="24"/>
+        </w:rPr>
+      </w:pPr>
+      <w:hyperlink w:anchor="_Toc237512878" w:history="1">
+        <w:r>
+          <w:rPr>
+            <w:rStyle w:val="Hyperlink"/>
+            <w:noProof/>
+          </w:rPr>
+          <w:t>2.4</w:t>
+        </w:r>
+        <w:r>
+          <w:rPr>
+            <w:rFonts w:eastAsiaTheme="minorEastAsia"/>
+            <w:smallCaps w:val="0"/>
+            <w:noProof/>
+            <w:sz w:val="24"/>
+            <w:szCs w:val="24"/>
+          </w:rPr>
+          <w:tab/>
+        </w:r>
+        <w:r>
+          <w:rPr>
+            <w:rStyle w:val="Hyperlink"/>
+            <w:noProof/>
+          </w:rPr>
+          <w:t>Edit Configuration File</w:t>
+        </w:r>
+        <w:r>
+          <w:rPr>
+            <w:noProof/>
+            <w:webHidden/>
+          </w:rPr>
+          <w:tab/>
+        </w:r>
+        <w:r>
+          <w:rPr>
+            <w:noProof/>
+            <w:webHidden/>
+          </w:rPr>
+          <w:fldChar w:fldCharType="begin"/>
+        </w:r>
+        <w:r>
+          <w:rPr>
+            <w:noProof/>
+            <w:webHidden/>
+          </w:rPr>
+          <w:instrText xml:space="preserve"> PAGEREF _Toc237512878 \h </w:instrText>
+        </w:r>
+        <w:r>
+          <w:rPr>
+            <w:noProof/>
+            <w:webHidden/>
+          </w:rPr>
+        </w:r>
+        <w:r>
+          <w:rPr>
+            <w:noProof/>
+            <w:webHidden/>
+          </w:rPr>
+          <w:fldChar w:fldCharType="separate"/>
+        </w:r>
+        <w:r>
+          <w:rPr>
+            <w:noProof/>
+            <w:webHidden/>
+          </w:rPr>
+          <w:t>3</w:t>
+        </w:r>
+        <w:r>
+          <w:rPr>
+            <w:noProof/>
+            <w:webHidden/>
+          </w:rPr>
+          <w:fldChar w:fldCharType="end"/>
+        </w:r>
+      </w:hyperlink>
+    </w:p>
+    <w:p>
+      <w:pPr>
+        <w:pStyle w:val="TOC2"/>
+        <w:tabs>
+          <w:tab w:val="left" w:pos="960"/>
+          <w:tab w:val="right" w:leader="dot" w:pos="9350"/>
+        </w:tabs>
+        <w:rPr>
+          <w:rFonts w:eastAsiaTheme="minorEastAsia"/>
+          <w:smallCaps w:val="0"/>
+          <w:noProof/>
+          <w:sz w:val="24"/>
+          <w:szCs w:val="24"/>
+        </w:rPr>
+      </w:pPr>
+      <w:hyperlink w:anchor="_Toc237512879" w:history="1">
+        <w:r>
+          <w:rPr>
+            <w:rStyle w:val="Hyperlink"/>
+            <w:noProof/>
+          </w:rPr>
+          <w:t>2.5</w:t>
+        </w:r>
+        <w:r>
+          <w:rPr>
+            <w:rFonts w:eastAsiaTheme="minorEastAsia"/>
+            <w:smallCaps w:val="0"/>
+            <w:noProof/>
+            <w:sz w:val="24"/>
+            <w:szCs w:val="24"/>
+          </w:rPr>
+          <w:tab/>
+        </w:r>
+        <w:r>
+          <w:rPr>
+            <w:rStyle w:val="Hyperlink"/>
+            <w:noProof/>
+          </w:rPr>
+          <w:t>Setup on ArcGIS Online</w:t>
+        </w:r>
+        <w:r>
+          <w:rPr>
+            <w:noProof/>
+            <w:webHidden/>
+          </w:rPr>
+          <w:tab/>
+        </w:r>
+        <w:r>
+          <w:rPr>
+            <w:noProof/>
+            <w:webHidden/>
+          </w:rPr>
+          <w:fldChar w:fldCharType="begin"/>
+        </w:r>
+        <w:r>
+          <w:rPr>
+            <w:noProof/>
+            <w:webHidden/>
+          </w:rPr>
+          <w:instrText xml:space="preserve"> PAGEREF _Toc237512879 \h </w:instrText>
+        </w:r>
+        <w:r>
+          <w:rPr>
+            <w:noProof/>
+            <w:webHidden/>
+          </w:rPr>
+        </w:r>
+        <w:r>
+          <w:rPr>
+            <w:noProof/>
+            <w:webHidden/>
+          </w:rPr>
+          <w:fldChar w:fldCharType="separate"/>
+        </w:r>
+        <w:r>
+          <w:rPr>
+            <w:noProof/>
+            <w:webHidden/>
+          </w:rPr>
+          <w:t>3</w:t>
+        </w:r>
+        <w:r>
+          <w:rPr>
+            <w:noProof/>
+            <w:webHidden/>
+          </w:rPr>
+          <w:fldChar w:fldCharType="end"/>
+        </w:r>
+      </w:hyperlink>
+    </w:p>
+    <w:p>
+      <w:pPr>
+        <w:pStyle w:val="TOC1"/>
+        <w:tabs>
+          <w:tab w:val="left" w:pos="480"/>
+          <w:tab w:val="right" w:leader="dot" w:pos="9350"/>
+        </w:tabs>
+        <w:rPr>
+          <w:rFonts w:eastAsiaTheme="minorEastAsia"/>
+          <w:b w:val="0"/>
+          <w:bCs w:val="0"/>
+          <w:caps w:val="0"/>
+          <w:noProof/>
+          <w:sz w:val="24"/>
+          <w:szCs w:val="24"/>
+        </w:rPr>
+      </w:pPr>
+      <w:hyperlink w:anchor="_Toc237512880" w:history="1">
+        <w:r>
+          <w:rPr>
+            <w:rStyle w:val="Hyperlink"/>
+            <w:noProof/>
+          </w:rPr>
+          <w:t>3</w:t>
+        </w:r>
+        <w:r>
+          <w:rPr>
+            <w:rFonts w:eastAsiaTheme="minorEastAsia"/>
+            <w:b w:val="0"/>
+            <w:bCs w:val="0"/>
+            <w:caps w:val="0"/>
+            <w:noProof/>
+            <w:sz w:val="24"/>
+            <w:szCs w:val="24"/>
+          </w:rPr>
+          <w:tab/>
+        </w:r>
+        <w:r>
+          <w:rPr>
+            <w:rStyle w:val="Hyperlink"/>
+            <w:noProof/>
+          </w:rPr>
+          <w:t>Use of tools</w:t>
+        </w:r>
+        <w:r>
+          <w:rPr>
+            <w:noProof/>
+            <w:webHidden/>
+          </w:rPr>
+          <w:tab/>
+        </w:r>
+        <w:r>
+          <w:rPr>
+            <w:noProof/>
+            <w:webHidden/>
+          </w:rPr>
+          <w:fldChar w:fldCharType="begin"/>
+        </w:r>
+        <w:r>
+          <w:rPr>
+            <w:noProof/>
+            <w:webHidden/>
+          </w:rPr>
+          <w:instrText xml:space="preserve"> PAGEREF _Toc237512880 \h </w:instrText>
+        </w:r>
+        <w:r>
+          <w:rPr>
+            <w:noProof/>
+            <w:webHidden/>
+          </w:rPr>
+        </w:r>
+        <w:r>
+          <w:rPr>
+            <w:noProof/>
+            <w:webHidden/>
+          </w:rPr>
+          <w:fldChar w:fldCharType="separate"/>
+        </w:r>
+        <w:r>
+          <w:rPr>
+            <w:noProof/>
+            <w:webHidden/>
+          </w:rPr>
+          <w:t>4</w:t>
+        </w:r>
+        <w:r>
+          <w:rPr>
+            <w:noProof/>
+            <w:webHidden/>
+          </w:rPr>
+          <w:fldChar w:fldCharType="end"/>
+        </w:r>
+      </w:hyperlink>
+    </w:p>
+    <w:p>
+      <w:pPr>
+        <w:pStyle w:val="TOC1"/>
+        <w:tabs>
+          <w:tab w:val="left" w:pos="480"/>
+          <w:tab w:val="right" w:leader="dot" w:pos="9350"/>
+        </w:tabs>
+        <w:rPr>
+          <w:rFonts w:eastAsiaTheme="minorEastAsia"/>
+          <w:b w:val="0"/>
+          <w:bCs w:val="0"/>
+          <w:caps w:val="0"/>
+          <w:noProof/>
+          <w:sz w:val="24"/>
+          <w:szCs w:val="24"/>
+        </w:rPr>
+      </w:pPr>
+      <w:hyperlink w:anchor="_Toc237512881" w:history="1">
+        <w:r>
+          <w:rPr>
+            <w:rStyle w:val="Hyperlink"/>
+            <w:noProof/>
+          </w:rPr>
+          <w:t>4</w:t>
+        </w:r>
+        <w:r>
+          <w:rPr>
+            <w:rFonts w:eastAsiaTheme="minorEastAsia"/>
+            <w:b w:val="0"/>
+            <w:bCs w:val="0"/>
+            <w:caps w:val="0"/>
+            <w:noProof/>
+            <w:sz w:val="24"/>
+            <w:szCs w:val="24"/>
+          </w:rPr>
+          <w:tab/>
+        </w:r>
+        <w:r>
+          <w:rPr>
+            <w:rStyle w:val="Hyperlink"/>
+            <w:noProof/>
+          </w:rPr>
+          <w:t>Appendices</w:t>
+        </w:r>
+        <w:r>
+          <w:rPr>
+            <w:noProof/>
+            <w:webHidden/>
+          </w:rPr>
+          <w:tab/>
+        </w:r>
+        <w:r>
+          <w:rPr>
+            <w:noProof/>
+            <w:webHidden/>
+          </w:rPr>
+          <w:fldChar w:fldCharType="begin"/>
+        </w:r>
+        <w:r>
+          <w:rPr>
+            <w:noProof/>
+            <w:webHidden/>
+          </w:rPr>
+          <w:instrText xml:space="preserve"> PAGEREF _Toc237512881 \h </w:instrText>
+        </w:r>
+        <w:r>
+          <w:rPr>
+            <w:noProof/>
+            <w:webHidden/>
+          </w:rPr>
+        </w:r>
+        <w:r>
+          <w:rPr>
+            <w:noProof/>
+            <w:webHidden/>
+          </w:rPr>
+          <w:fldChar w:fldCharType="separate"/>
+        </w:r>
+        <w:r>
+          <w:rPr>
+            <w:noProof/>
+            <w:webHidden/>
+          </w:rPr>
+          <w:t>4</w:t>
+        </w:r>
+        <w:r>
+          <w:rPr>
+            <w:noProof/>
+            <w:webHidden/>
+          </w:rPr>
+          <w:fldChar w:fldCharType="end"/>
+        </w:r>
+      </w:hyperlink>
+    </w:p>
+    <w:p>
+      <w:r>
+        <w:fldChar w:fldCharType="end"/>
+      </w:r>
+    </w:p>
+    <w:p/>
+    <w:p>
+      <w:pPr>
         <w:pStyle w:val="Heading5"/>
       </w:pPr>
+      <w:bookmarkStart w:id="0" w:name="_Toc237512872"/>
       <w:r>
         <w:t>version notes</w:t>
       </w:r>
+      <w:bookmarkEnd w:id="0"/>
     </w:p>
     <w:p>
       <w:pPr>
@@ -70,29 +967,35 @@
       <w:pPr>
         <w:pStyle w:val="Heading5"/>
       </w:pPr>
+      <w:bookmarkStart w:id="1" w:name="_Toc237512873"/>
       <w:r>
         <w:t>purpose of tools / purpose of manual</w:t>
       </w:r>
+      <w:bookmarkEnd w:id="1"/>
     </w:p>
     <w:p/>
     <w:p>
       <w:pPr>
         <w:pStyle w:val="Heading1"/>
       </w:pPr>
+      <w:bookmarkStart w:id="2" w:name="_Toc237512874"/>
       <w:r>
         <w:t>S</w:t>
       </w:r>
       <w:r>
         <w:t>etup –how to prepare to use</w:t>
       </w:r>
+      <w:bookmarkEnd w:id="2"/>
     </w:p>
     <w:p>
       <w:pPr>
         <w:pStyle w:val="Heading2"/>
       </w:pPr>
+      <w:bookmarkStart w:id="3" w:name="_Toc237512875"/>
       <w:r>
         <w:t>Clone the repository</w:t>
       </w:r>
+      <w:bookmarkEnd w:id="3"/>
     </w:p>
     <w:p>
       <w:r>
@@ -168,9 +1071,12 @@
       <w:pPr>
         <w:pStyle w:val="Heading2"/>
       </w:pPr>
-      <w:r>
+      <w:bookmarkStart w:id="4" w:name="_Toc237512876"/>
+      <w:r>
+        <w:lastRenderedPageBreak/>
         <w:t>Install required packages</w:t>
       </w:r>
+      <w:bookmarkEnd w:id="4"/>
     </w:p>
     <w:p>
       <w:r>
@@ -212,9 +1118,11 @@
       <w:pPr>
         <w:pStyle w:val="Heading2"/>
       </w:pPr>
+      <w:bookmarkStart w:id="5" w:name="_Toc237512877"/>
       <w:r>
         <w:t>Create a desktop shortcut</w:t>
       </w:r>
+      <w:bookmarkEnd w:id="5"/>
     </w:p>
     <w:p>
       <w:r>
@@ -223,7 +1131,6 @@
     </w:p>
     <w:p>
       <w:r>
-        <w:lastRenderedPageBreak/>
         <w:t xml:space="preserve">An alternative is to open the RStudio development environment with the working directory set to the home folder of your Seagrass Restoration Project folder (either by opening an RStudio project with the same home folder, or by setting the location with </w:t>
       </w:r>
       <w:proofErr w:type="spellStart"/>
@@ -256,7 +1163,7 @@
                     <pic:cNvPicPr/>
                   </pic:nvPicPr>
                   <pic:blipFill>
-                    <a:blip r:embed="rId5"/>
+                    <a:blip r:embed="rId6"/>
                     <a:stretch>
                       <a:fillRect/>
                     </a:stretch>
@@ -310,7 +1217,7 @@
                     <pic:cNvPicPr/>
                   </pic:nvPicPr>
                   <pic:blipFill>
-                    <a:blip r:embed="rId6"/>
+                    <a:blip r:embed="rId7"/>
                     <a:stretch>
                       <a:fillRect/>
                     </a:stretch>
@@ -354,7 +1261,7 @@
                     <pic:cNvPicPr/>
                   </pic:nvPicPr>
                   <pic:blipFill>
-                    <a:blip r:embed="rId7"/>
+                    <a:blip r:embed="rId8"/>
                     <a:stretch>
                       <a:fillRect/>
                     </a:stretch>
@@ -381,7 +1288,6 @@
         <w:rPr>
           <w:noProof/>
         </w:rPr>
-        <w:lastRenderedPageBreak/>
         <w:drawing>
           <wp:inline distT="0" distB="0" distL="0" distR="0" wp14:anchorId="16B99AA5" wp14:editId="033D6B2F">
             <wp:extent cx="5943600" cy="610870"/>
@@ -398,7 +1304,7 @@
                     <pic:cNvPicPr/>
                   </pic:nvPicPr>
                   <pic:blipFill>
-                    <a:blip r:embed="rId8"/>
+                    <a:blip r:embed="rId9"/>
                     <a:stretch>
                       <a:fillRect/>
                     </a:stretch>
@@ -540,14 +1446,31 @@
         <w:t>;$Folder", "User")</w:t>
       </w:r>
     </w:p>
+    <w:p>
+      <w:pPr>
+        <w:ind w:left="720"/>
+      </w:pPr>
+    </w:p>
+    <w:p>
+      <w:pPr>
+        <w:pStyle w:val="Heading2"/>
+      </w:pPr>
+      <w:bookmarkStart w:id="6" w:name="_Toc237512878"/>
+      <w:r>
+        <w:t>Edit Configuration File</w:t>
+      </w:r>
+      <w:bookmarkEnd w:id="6"/>
+    </w:p>
     <w:p/>
     <w:p>
       <w:pPr>
         <w:pStyle w:val="Heading2"/>
       </w:pPr>
+      <w:bookmarkStart w:id="7" w:name="_Toc237512879"/>
       <w:r>
         <w:t>Setup on ArcGIS Online</w:t>
       </w:r>
+      <w:bookmarkEnd w:id="7"/>
     </w:p>
     <w:p/>
     <w:p/>
@@ -557,9 +1480,11 @@
       <w:pPr>
         <w:pStyle w:val="Heading1"/>
       </w:pPr>
+      <w:bookmarkStart w:id="8" w:name="_Toc237512880"/>
       <w:r>
         <w:t>Use of tools</w:t>
       </w:r>
+      <w:bookmarkEnd w:id="8"/>
     </w:p>
     <w:p/>
     <w:p/>
@@ -567,9 +1492,11 @@
       <w:pPr>
         <w:pStyle w:val="Heading1"/>
       </w:pPr>
+      <w:bookmarkStart w:id="9" w:name="_Toc237512881"/>
       <w:r>
         <w:t>Appendices</w:t>
       </w:r>
+      <w:bookmarkEnd w:id="9"/>
     </w:p>
     <w:p>
       <w:r>
@@ -586,7 +1513,6 @@
     </w:p>
     <w:p>
       <w:r>
-        <w:lastRenderedPageBreak/>
         <w:t>Code Structure</w:t>
       </w:r>
       <w:r>
@@ -1824,6 +2750,173 @@
       <w:shd w:val="clear" w:color="auto" w:fill="E1DFDD"/>
     </w:rPr>
   </w:style>
+  <w:style w:type="paragraph" w:styleId="TOC1">
+    <w:name w:val="toc 1"/>
+    <w:basedOn w:val="Normal"/>
+    <w:next w:val="Normal"/>
+    <w:autoRedefine/>
+    <w:uiPriority w:val="39"/>
+    <w:unhideWhenUsed/>
+    <w:rsid w:val="00B62524"/>
+    <w:pPr>
+      <w:spacing w:before="120" w:after="120"/>
+    </w:pPr>
+    <w:rPr>
+      <w:rFonts w:asciiTheme="minorHAnsi" w:hAnsiTheme="minorHAnsi"/>
+      <w:b/>
+      <w:bCs/>
+      <w:caps/>
+      <w:sz w:val="20"/>
+      <w:szCs w:val="20"/>
+    </w:rPr>
+  </w:style>
+  <w:style w:type="paragraph" w:styleId="TOC2">
+    <w:name w:val="toc 2"/>
+    <w:basedOn w:val="Normal"/>
+    <w:next w:val="Normal"/>
+    <w:autoRedefine/>
+    <w:uiPriority w:val="39"/>
+    <w:unhideWhenUsed/>
+    <w:rsid w:val="00B62524"/>
+    <w:pPr>
+      <w:spacing w:after="0"/>
+      <w:ind w:left="240"/>
+    </w:pPr>
+    <w:rPr>
+      <w:rFonts w:asciiTheme="minorHAnsi" w:hAnsiTheme="minorHAnsi"/>
+      <w:smallCaps/>
+      <w:sz w:val="20"/>
+      <w:szCs w:val="20"/>
+    </w:rPr>
+  </w:style>
+  <w:style w:type="paragraph" w:styleId="TOC3">
+    <w:name w:val="toc 3"/>
+    <w:basedOn w:val="Normal"/>
+    <w:next w:val="Normal"/>
+    <w:autoRedefine/>
+    <w:uiPriority w:val="39"/>
+    <w:unhideWhenUsed/>
+    <w:rsid w:val="00B62524"/>
+    <w:pPr>
+      <w:spacing w:after="0"/>
+      <w:ind w:left="480"/>
+    </w:pPr>
+    <w:rPr>
+      <w:rFonts w:asciiTheme="minorHAnsi" w:hAnsiTheme="minorHAnsi"/>
+      <w:i/>
+      <w:iCs/>
+      <w:sz w:val="20"/>
+      <w:szCs w:val="20"/>
+    </w:rPr>
+  </w:style>
+  <w:style w:type="paragraph" w:styleId="TOC4">
+    <w:name w:val="toc 4"/>
+    <w:basedOn w:val="Normal"/>
+    <w:next w:val="Normal"/>
+    <w:autoRedefine/>
+    <w:uiPriority w:val="39"/>
+    <w:unhideWhenUsed/>
+    <w:rsid w:val="00B62524"/>
+    <w:pPr>
+      <w:spacing w:after="0"/>
+      <w:ind w:left="720"/>
+    </w:pPr>
+    <w:rPr>
+      <w:rFonts w:asciiTheme="minorHAnsi" w:hAnsiTheme="minorHAnsi"/>
+      <w:sz w:val="18"/>
+      <w:szCs w:val="18"/>
+    </w:rPr>
+  </w:style>
+  <w:style w:type="paragraph" w:styleId="TOC5">
+    <w:name w:val="toc 5"/>
+    <w:basedOn w:val="Normal"/>
+    <w:next w:val="Normal"/>
+    <w:autoRedefine/>
+    <w:uiPriority w:val="39"/>
+    <w:unhideWhenUsed/>
+    <w:rsid w:val="00B62524"/>
+    <w:pPr>
+      <w:spacing w:after="0"/>
+      <w:ind w:left="960"/>
+    </w:pPr>
+    <w:rPr>
+      <w:rFonts w:asciiTheme="minorHAnsi" w:hAnsiTheme="minorHAnsi"/>
+      <w:sz w:val="18"/>
+      <w:szCs w:val="18"/>
+    </w:rPr>
+  </w:style>
+  <w:style w:type="paragraph" w:styleId="TOC6">
+    <w:name w:val="toc 6"/>
+    <w:basedOn w:val="Normal"/>
+    <w:next w:val="Normal"/>
+    <w:autoRedefine/>
+    <w:uiPriority w:val="39"/>
+    <w:unhideWhenUsed/>
+    <w:rsid w:val="00B62524"/>
+    <w:pPr>
+      <w:spacing w:after="0"/>
+      <w:ind w:left="1200"/>
+    </w:pPr>
+    <w:rPr>
+      <w:rFonts w:asciiTheme="minorHAnsi" w:hAnsiTheme="minorHAnsi"/>
+      <w:sz w:val="18"/>
+      <w:szCs w:val="18"/>
+    </w:rPr>
+  </w:style>
+  <w:style w:type="paragraph" w:styleId="TOC7">
+    <w:name w:val="toc 7"/>
+    <w:basedOn w:val="Normal"/>
+    <w:next w:val="Normal"/>
+    <w:autoRedefine/>
+    <w:uiPriority w:val="39"/>
+    <w:unhideWhenUsed/>
+    <w:rsid w:val="00B62524"/>
+    <w:pPr>
+      <w:spacing w:after="0"/>
+      <w:ind w:left="1440"/>
+    </w:pPr>
+    <w:rPr>
+      <w:rFonts w:asciiTheme="minorHAnsi" w:hAnsiTheme="minorHAnsi"/>
+      <w:sz w:val="18"/>
+      <w:szCs w:val="18"/>
+    </w:rPr>
+  </w:style>
+  <w:style w:type="paragraph" w:styleId="TOC8">
+    <w:name w:val="toc 8"/>
+    <w:basedOn w:val="Normal"/>
+    <w:next w:val="Normal"/>
+    <w:autoRedefine/>
+    <w:uiPriority w:val="39"/>
+    <w:unhideWhenUsed/>
+    <w:rsid w:val="00B62524"/>
+    <w:pPr>
+      <w:spacing w:after="0"/>
+      <w:ind w:left="1680"/>
+    </w:pPr>
+    <w:rPr>
+      <w:rFonts w:asciiTheme="minorHAnsi" w:hAnsiTheme="minorHAnsi"/>
+      <w:sz w:val="18"/>
+      <w:szCs w:val="18"/>
+    </w:rPr>
+  </w:style>
+  <w:style w:type="paragraph" w:styleId="TOC9">
+    <w:name w:val="toc 9"/>
+    <w:basedOn w:val="Normal"/>
+    <w:next w:val="Normal"/>
+    <w:autoRedefine/>
+    <w:uiPriority w:val="39"/>
+    <w:unhideWhenUsed/>
+    <w:rsid w:val="00B62524"/>
+    <w:pPr>
+      <w:spacing w:after="0"/>
+      <w:ind w:left="1920"/>
+    </w:pPr>
+    <w:rPr>
+      <w:rFonts w:asciiTheme="minorHAnsi" w:hAnsiTheme="minorHAnsi"/>
+      <w:sz w:val="18"/>
+      <w:szCs w:val="18"/>
+    </w:rPr>
+  </w:style>
 </w:styles>
 </file>
 
@@ -2120,4 +3213,16 @@
     </a:ext>
   </a:extLst>
 </a:theme>
+</file>
+
+<file path=customXml/item1.xml><?xml version="1.0" encoding="utf-8"?>
+<b:Sources xmlns:b="http://schemas.openxmlformats.org/officeDocument/2006/bibliography" xmlns="http://schemas.openxmlformats.org/officeDocument/2006/bibliography" SelectedStyle="\APASixthEditionOfficeOnline.xsl" StyleName="APA" Version="6"/>
+</file>
+
+<file path=customXml/itemProps1.xml><?xml version="1.0" encoding="utf-8"?>
+<ds:datastoreItem xmlns:ds="http://schemas.openxmlformats.org/officeDocument/2006/customXml" ds:itemID="{565083E8-021F-46C3-83BE-7AB390CBD050}">
+  <ds:schemaRefs>
+    <ds:schemaRef ds:uri="http://schemas.openxmlformats.org/officeDocument/2006/bibliography"/>
+  </ds:schemaRefs>
+</ds:datastoreItem>
 </file>
</xml_diff>